<commit_message>
fixing Manual de Instalacion de GLPI
</commit_message>
<xml_diff>
--- a/docs/install/Instalacion de GLPI.docx
+++ b/docs/install/Instalacion de GLPI.docx
@@ -1,6 +1,6 @@
 
 <file path=word/document.xml><?xml version="1.0" encoding="utf-8"?>
-<w:document xmlns:wpc="http://schemas.microsoft.com/office/word/2010/wordprocessingCanvas" xmlns:cx="http://schemas.microsoft.com/office/drawing/2014/chartex" xmlns:cx1="http://schemas.microsoft.com/office/drawing/2015/9/8/chartex" xmlns:cx2="http://schemas.microsoft.com/office/drawing/2015/10/21/chartex" xmlns:cx3="http://schemas.microsoft.com/office/drawing/2016/5/9/chartex" xmlns:cx4="http://schemas.microsoft.com/office/drawing/2016/5/10/chartex" xmlns:cx5="http://schemas.microsoft.com/office/drawing/2016/5/11/chartex" xmlns:cx6="http://schemas.microsoft.com/office/drawing/2016/5/12/chartex" xmlns:cx7="http://schemas.microsoft.com/office/drawing/2016/5/13/chartex" xmlns:cx8="http://schemas.microsoft.com/office/drawing/2016/5/14/chartex" xmlns:mc="http://schemas.openxmlformats.org/markup-compatibility/2006" xmlns:aink="http://schemas.microsoft.com/office/drawing/2016/ink" xmlns:am3d="http://schemas.microsoft.com/office/drawing/2017/model3d" xmlns:o="urn:schemas-microsoft-com:office:office" xmlns:oel="http://schemas.microsoft.com/office/2019/extlst" xmlns:r="http://schemas.openxmlformats.org/officeDocument/2006/relationships" xmlns:m="http://schemas.openxmlformats.org/officeDocument/2006/math" xmlns:v="urn:schemas-microsoft-com:vml" xmlns:wp14="http://schemas.microsoft.com/office/word/2010/wordprocessingDrawing" xmlns:wp="http://schemas.openxmlformats.org/drawingml/2006/wordprocessingDrawing" xmlns:w10="urn:schemas-microsoft-com:office:word" xmlns:w="http://schemas.openxmlformats.org/wordprocessingml/2006/main" xmlns:w14="http://schemas.microsoft.com/office/word/2010/wordml" xmlns:w15="http://schemas.microsoft.com/office/word/2012/wordml" xmlns:w16cex="http://schemas.microsoft.com/office/word/2018/wordml/cex" xmlns:w16cid="http://schemas.microsoft.com/office/word/2016/wordml/cid" xmlns:w16="http://schemas.microsoft.com/office/word/2018/wordml" xmlns:w16du="http://schemas.microsoft.com/office/word/2023/wordml/word16du" xmlns:w16sdtdh="http://schemas.microsoft.com/office/word/2020/wordml/sdtdatahash" xmlns:w16sdtfl="http://schemas.microsoft.com/office/word/2024/wordml/sdtformatlock" xmlns:w16se="http://schemas.microsoft.com/office/word/2015/wordml/symex" xmlns:wpg="http://schemas.microsoft.com/office/word/2010/wordprocessingGroup" xmlns:wpi="http://schemas.microsoft.com/office/word/2010/wordprocessingInk" xmlns:wne="http://schemas.microsoft.com/office/word/2006/wordml" xmlns:wps="http://schemas.microsoft.com/office/word/2010/wordprocessingShape" mc:Ignorable="w14 w15 w16se w16cid w16 w16cex w16sdtdh w16sdtfl w16du wp14">
+<w:document xmlns:wpc="http://schemas.microsoft.com/office/word/2010/wordprocessingCanvas" xmlns:cx="http://schemas.microsoft.com/office/drawing/2014/chartex" xmlns:cx1="http://schemas.microsoft.com/office/drawing/2015/9/8/chartex" xmlns:cx2="http://schemas.microsoft.com/office/drawing/2015/10/21/chartex" xmlns:cx3="http://schemas.microsoft.com/office/drawing/2016/5/9/chartex" xmlns:cx4="http://schemas.microsoft.com/office/drawing/2016/5/10/chartex" xmlns:cx5="http://schemas.microsoft.com/office/drawing/2016/5/11/chartex" xmlns:cx6="http://schemas.microsoft.com/office/drawing/2016/5/12/chartex" xmlns:cx7="http://schemas.microsoft.com/office/drawing/2016/5/13/chartex" xmlns:cx8="http://schemas.microsoft.com/office/drawing/2016/5/14/chartex" xmlns:mc="http://schemas.openxmlformats.org/markup-compatibility/2006" xmlns:aink="http://schemas.microsoft.com/office/drawing/2016/ink" xmlns:am3d="http://schemas.microsoft.com/office/drawing/2017/model3d" xmlns:o="urn:schemas-microsoft-com:office:office" xmlns:oel="http://schemas.microsoft.com/office/2019/extlst" xmlns:r="http://schemas.openxmlformats.org/officeDocument/2006/relationships" xmlns:m="http://schemas.openxmlformats.org/officeDocument/2006/math" xmlns:v="urn:schemas-microsoft-com:vml" xmlns:wp14="http://schemas.microsoft.com/office/word/2010/wordprocessingDrawing" xmlns:wp="http://schemas.openxmlformats.org/drawingml/2006/wordprocessingDrawing" xmlns:w10="urn:schemas-microsoft-com:office:word" xmlns:w="http://schemas.openxmlformats.org/wordprocessingml/2006/main" xmlns:w14="http://schemas.microsoft.com/office/word/2010/wordml" xmlns:w15="http://schemas.microsoft.com/office/word/2012/wordml" xmlns:w16cex="http://schemas.microsoft.com/office/word/2018/wordml/cex" xmlns:w16cid="http://schemas.microsoft.com/office/word/2016/wordml/cid" xmlns:w16="http://schemas.microsoft.com/office/word/2018/wordml" xmlns:w16du="http://schemas.microsoft.com/office/word/2023/wordml/word16du" xmlns:w16sdtdh="http://schemas.microsoft.com/office/word/2020/wordml/sdtdatahash" xmlns:w16se="http://schemas.microsoft.com/office/word/2015/wordml/symex" xmlns:wpg="http://schemas.microsoft.com/office/word/2010/wordprocessingGroup" xmlns:wpi="http://schemas.microsoft.com/office/word/2010/wordprocessingInk" xmlns:wne="http://schemas.microsoft.com/office/word/2006/wordml" xmlns:wps="http://schemas.microsoft.com/office/word/2010/wordprocessingShape" mc:Ignorable="w14 w15 w16se w16cid w16 w16cex w16sdtdh w16du wp14">
   <w:body>
     <w:p>
       <w:pPr>
@@ -262,7 +262,7 @@
     </w:p>
     <w:p>
       <w:pPr>
-        <w:pStyle w:val="Prrafodelista"/>
+        <w:pStyle w:val="ListParagraph"/>
         <w:numPr>
           <w:ilvl w:val="0"/>
           <w:numId w:val="15"/>
@@ -303,7 +303,6 @@
           <w:sz w:val="20"/>
           <w:szCs w:val="20"/>
         </w:rPr>
-        <w:fldChar w:fldCharType="separate"/>
       </w:r>
       <w:r>
         <w:rPr>
@@ -311,12 +310,20 @@
           <w:sz w:val="20"/>
           <w:szCs w:val="20"/>
         </w:rPr>
+        <w:fldChar w:fldCharType="separate"/>
+      </w:r>
+      <w:r>
+        <w:rPr>
+          <w:rFonts w:ascii="Arial" w:hAnsi="Arial" w:cs="Arial"/>
+          <w:sz w:val="20"/>
+          <w:szCs w:val="20"/>
+        </w:rPr>
         <w:t>Proxmox Virtual Environment</w:t>
       </w:r>
     </w:p>
     <w:p>
       <w:pPr>
-        <w:pStyle w:val="Prrafodelista"/>
+        <w:pStyle w:val="ListParagraph"/>
         <w:numPr>
           <w:ilvl w:val="0"/>
           <w:numId w:val="15"/>
@@ -326,18 +333,18 @@
         <w:fldChar w:fldCharType="end"/>
       </w:r>
       <w:r>
-        <w:t xml:space="preserve">Linux </w:t>
-      </w:r>
-      <w:r>
         <w:t>U</w:t>
       </w:r>
       <w:r>
         <w:t>buntu 24.04</w:t>
       </w:r>
-    </w:p>
-    <w:p>
-      <w:pPr>
-        <w:pStyle w:val="Prrafodelista"/>
+      <w:r>
+        <w:t xml:space="preserve"> LTS</w:t>
+      </w:r>
+    </w:p>
+    <w:p>
+      <w:pPr>
+        <w:pStyle w:val="ListParagraph"/>
         <w:numPr>
           <w:ilvl w:val="0"/>
           <w:numId w:val="15"/>
@@ -359,7 +366,7 @@
     </w:p>
     <w:p>
       <w:pPr>
-        <w:pStyle w:val="Prrafodelista"/>
+        <w:pStyle w:val="ListParagraph"/>
         <w:numPr>
           <w:ilvl w:val="0"/>
           <w:numId w:val="15"/>
@@ -381,7 +388,7 @@
     </w:p>
     <w:p>
       <w:pPr>
-        <w:pStyle w:val="Prrafodelista"/>
+        <w:pStyle w:val="ListParagraph"/>
         <w:numPr>
           <w:ilvl w:val="0"/>
           <w:numId w:val="15"/>
@@ -403,7 +410,7 @@
     </w:p>
     <w:p>
       <w:pPr>
-        <w:pStyle w:val="Prrafodelista"/>
+        <w:pStyle w:val="ListParagraph"/>
         <w:numPr>
           <w:ilvl w:val="0"/>
           <w:numId w:val="15"/>
@@ -425,7 +432,7 @@
     </w:p>
     <w:p>
       <w:pPr>
-        <w:pStyle w:val="Prrafodelista"/>
+        <w:pStyle w:val="ListParagraph"/>
         <w:numPr>
           <w:ilvl w:val="0"/>
           <w:numId w:val="15"/>
@@ -447,7 +454,7 @@
     </w:p>
     <w:p>
       <w:pPr>
-        <w:pStyle w:val="Prrafodelista"/>
+        <w:pStyle w:val="ListParagraph"/>
         <w:numPr>
           <w:ilvl w:val="0"/>
           <w:numId w:val="15"/>
@@ -469,7 +476,7 @@
     </w:p>
     <w:p>
       <w:pPr>
-        <w:pStyle w:val="Prrafodelista"/>
+        <w:pStyle w:val="ListParagraph"/>
         <w:numPr>
           <w:ilvl w:val="0"/>
           <w:numId w:val="15"/>
@@ -491,7 +498,7 @@
     </w:p>
     <w:p>
       <w:pPr>
-        <w:pStyle w:val="Prrafodelista"/>
+        <w:pStyle w:val="ListParagraph"/>
         <w:numPr>
           <w:ilvl w:val="0"/>
           <w:numId w:val="15"/>
@@ -523,7 +530,7 @@
     </w:p>
     <w:p>
       <w:pPr>
-        <w:pStyle w:val="Prrafodelista"/>
+        <w:pStyle w:val="ListParagraph"/>
         <w:numPr>
           <w:ilvl w:val="0"/>
           <w:numId w:val="15"/>
@@ -555,7 +562,7 @@
     </w:p>
     <w:p>
       <w:pPr>
-        <w:pStyle w:val="Prrafodelista"/>
+        <w:pStyle w:val="ListParagraph"/>
         <w:numPr>
           <w:ilvl w:val="0"/>
           <w:numId w:val="15"/>
@@ -577,7 +584,7 @@
     </w:p>
     <w:p>
       <w:pPr>
-        <w:pStyle w:val="Prrafodelista"/>
+        <w:pStyle w:val="ListParagraph"/>
         <w:numPr>
           <w:ilvl w:val="0"/>
           <w:numId w:val="15"/>
@@ -614,7 +621,7 @@
     </w:p>
     <w:p>
       <w:pPr>
-        <w:pStyle w:val="Prrafodelista"/>
+        <w:pStyle w:val="ListParagraph"/>
         <w:numPr>
           <w:ilvl w:val="0"/>
           <w:numId w:val="7"/>
@@ -631,20 +638,15 @@
           <w:sz w:val="20"/>
           <w:szCs w:val="20"/>
         </w:rPr>
-        <w:t>Sistema operativo: Linux Ubuntu 2</w:t>
-      </w:r>
-      <w:r>
-        <w:rPr>
-          <w:rFonts w:ascii="Arial" w:hAnsi="Arial" w:cs="Arial"/>
-          <w:sz w:val="20"/>
-          <w:szCs w:val="20"/>
-        </w:rPr>
-        <w:t>4.04</w:t>
-      </w:r>
-    </w:p>
-    <w:p>
-      <w:pPr>
-        <w:pStyle w:val="Prrafodelista"/>
+        <w:t>Sistema operativo: Ubuntu 24.04</w:t>
+      </w:r>
+      <w:r>
+        <w:t xml:space="preserve"> LTS</w:t>
+      </w:r>
+    </w:p>
+    <w:p>
+      <w:pPr>
+        <w:pStyle w:val="ListParagraph"/>
         <w:numPr>
           <w:ilvl w:val="0"/>
           <w:numId w:val="7"/>
@@ -666,7 +668,7 @@
     </w:p>
     <w:p>
       <w:pPr>
-        <w:pStyle w:val="Prrafodelista"/>
+        <w:pStyle w:val="ListParagraph"/>
         <w:numPr>
           <w:ilvl w:val="0"/>
           <w:numId w:val="7"/>
@@ -686,17 +688,12 @@
         <w:t>PHP: 8.</w:t>
       </w:r>
       <w:r>
-        <w:rPr>
-          <w:rFonts w:ascii="Arial" w:hAnsi="Arial" w:cs="Arial"/>
-          <w:sz w:val="20"/>
-          <w:szCs w:val="20"/>
-        </w:rPr>
-        <w:t>2</w:t>
-      </w:r>
-    </w:p>
-    <w:p>
-      <w:pPr>
-        <w:pStyle w:val="Prrafodelista"/>
+        <w:t>3</w:t>
+      </w:r>
+    </w:p>
+    <w:p>
+      <w:pPr>
+        <w:pStyle w:val="ListParagraph"/>
         <w:numPr>
           <w:ilvl w:val="0"/>
           <w:numId w:val="7"/>
@@ -718,7 +715,7 @@
     </w:p>
     <w:p>
       <w:pPr>
-        <w:pStyle w:val="Prrafodelista"/>
+        <w:pStyle w:val="ListParagraph"/>
         <w:numPr>
           <w:ilvl w:val="0"/>
           <w:numId w:val="7"/>
@@ -749,6 +746,54 @@
     <w:p>
       <w:pPr>
         <w:rPr>
+          <w:b/>
+          <w:bCs/>
+        </w:rPr>
+      </w:pPr>
+    </w:p>
+    <w:p>
+      <w:pPr>
+        <w:rPr>
+          <w:b/>
+          <w:bCs/>
+        </w:rPr>
+      </w:pPr>
+    </w:p>
+    <w:p>
+      <w:pPr>
+        <w:rPr>
+          <w:b/>
+          <w:bCs/>
+        </w:rPr>
+      </w:pPr>
+    </w:p>
+    <w:p>
+      <w:pPr>
+        <w:rPr>
+          <w:b/>
+          <w:bCs/>
+        </w:rPr>
+      </w:pPr>
+    </w:p>
+    <w:p>
+      <w:pPr>
+        <w:rPr>
+          <w:b/>
+          <w:bCs/>
+        </w:rPr>
+      </w:pPr>
+    </w:p>
+    <w:p>
+      <w:pPr>
+        <w:rPr>
+          <w:b/>
+          <w:bCs/>
+        </w:rPr>
+      </w:pPr>
+    </w:p>
+    <w:p>
+      <w:pPr>
+        <w:rPr>
           <w:rFonts w:ascii="Arial" w:hAnsi="Arial" w:cs="Arial"/>
           <w:b/>
           <w:bCs/>
@@ -764,9 +809,365 @@
           <w:sz w:val="28"/>
           <w:szCs w:val="28"/>
         </w:rPr>
-        <w:t xml:space="preserve">3. </w:t>
-      </w:r>
-      <w:r>
+        <w:lastRenderedPageBreak/>
+        <w:t>3. Instalación de dependencias</w:t>
+      </w:r>
+    </w:p>
+    <w:p>
+      <w:pPr>
+        <w:rPr>
+          <w:b/>
+          <w:bCs/>
+        </w:rPr>
+      </w:pPr>
+      <w:r>
+        <w:rPr>
+          <w:b/>
+          <w:bCs/>
+        </w:rPr>
+        <w:t>3.1. Actualizar el sistema</w:t>
+      </w:r>
+    </w:p>
+    <w:p>
+      <w:pPr>
+        <w:pStyle w:val="BlockCode"/>
+        <w:ind w:left="720"/>
+      </w:pPr>
+      <w:r>
+        <w:t>sudo apt update</w:t>
+      </w:r>
+    </w:p>
+    <w:p>
+      <w:pPr>
+        <w:pStyle w:val="BlockCode"/>
+        <w:ind w:left="720"/>
+      </w:pPr>
+      <w:r>
+        <w:t>sudo apt upgrade -y</w:t>
+      </w:r>
+    </w:p>
+    <w:p/>
+    <w:p>
+      <w:pPr>
+        <w:rPr>
+          <w:b/>
+          <w:bCs/>
+        </w:rPr>
+      </w:pPr>
+      <w:r>
+        <w:rPr>
+          <w:b/>
+          <w:bCs/>
+        </w:rPr>
+        <w:t>3.2. Instalar Apache</w:t>
+      </w:r>
+    </w:p>
+    <w:p>
+      <w:pPr>
+        <w:pStyle w:val="BlockCode"/>
+        <w:ind w:left="720"/>
+      </w:pPr>
+      <w:r>
+        <w:t>sudo apt install -y apache2</w:t>
+      </w:r>
+    </w:p>
+    <w:p>
+      <w:pPr>
+        <w:pStyle w:val="BlockCode"/>
+        <w:ind w:left="720"/>
+      </w:pPr>
+      <w:r>
+        <w:t>sudo systemctl enable apache2</w:t>
+      </w:r>
+    </w:p>
+    <w:p>
+      <w:pPr>
+        <w:pStyle w:val="BlockCode"/>
+        <w:ind w:left="720"/>
+      </w:pPr>
+      <w:r>
+        <w:t>sudo systemctl start apache2</w:t>
+      </w:r>
+    </w:p>
+    <w:p/>
+    <w:p>
+      <w:pPr>
+        <w:rPr>
+          <w:b/>
+          <w:bCs/>
+        </w:rPr>
+      </w:pPr>
+      <w:r>
+        <w:rPr>
+          <w:b/>
+          <w:bCs/>
+        </w:rPr>
+        <w:t>3.3. Instalar PHP y Extensiones</w:t>
+      </w:r>
+    </w:p>
+    <w:p>
+      <w:pPr>
+        <w:pStyle w:val="BlockCode"/>
+        <w:ind w:left="720"/>
+      </w:pPr>
+      <w:r>
+        <w:t>sudo apt install -y</w:t>
+      </w:r>
+      <w:r>
+        <w:t xml:space="preserve"> </w:t>
+      </w:r>
+      <w:r>
+        <w:t>\</w:t>
+      </w:r>
+    </w:p>
+    <w:p>
+      <w:pPr>
+        <w:pStyle w:val="BlockCode"/>
+        <w:ind w:left="720"/>
+      </w:pPr>
+      <w:r>
+        <w:t>php \</w:t>
+      </w:r>
+    </w:p>
+    <w:p>
+      <w:pPr>
+        <w:pStyle w:val="BlockCode"/>
+        <w:ind w:left="720"/>
+      </w:pPr>
+      <w:r>
+        <w:t>php-cli \</w:t>
+      </w:r>
+    </w:p>
+    <w:p>
+      <w:pPr>
+        <w:pStyle w:val="BlockCode"/>
+        <w:ind w:left="720"/>
+      </w:pPr>
+      <w:r>
+        <w:t>php-common \</w:t>
+      </w:r>
+    </w:p>
+    <w:p>
+      <w:pPr>
+        <w:pStyle w:val="BlockCode"/>
+        <w:ind w:left="720"/>
+      </w:pPr>
+      <w:r>
+        <w:t>php-mysql \</w:t>
+      </w:r>
+    </w:p>
+    <w:p>
+      <w:pPr>
+        <w:pStyle w:val="BlockCode"/>
+        <w:ind w:left="720"/>
+      </w:pPr>
+      <w:r>
+        <w:t>php-zip \</w:t>
+      </w:r>
+    </w:p>
+    <w:p>
+      <w:pPr>
+        <w:pStyle w:val="BlockCode"/>
+        <w:ind w:left="720"/>
+      </w:pPr>
+      <w:r>
+        <w:t>php-gd \</w:t>
+      </w:r>
+    </w:p>
+    <w:p>
+      <w:pPr>
+        <w:pStyle w:val="BlockCode"/>
+        <w:ind w:left="720"/>
+      </w:pPr>
+      <w:r>
+        <w:t>php-mbstring \</w:t>
+      </w:r>
+    </w:p>
+    <w:p>
+      <w:pPr>
+        <w:pStyle w:val="BlockCode"/>
+        <w:ind w:left="720"/>
+      </w:pPr>
+      <w:r>
+        <w:t>php-curl \</w:t>
+      </w:r>
+    </w:p>
+    <w:p>
+      <w:pPr>
+        <w:pStyle w:val="BlockCode"/>
+        <w:ind w:left="720"/>
+      </w:pPr>
+      <w:r>
+        <w:t>php-xml \</w:t>
+      </w:r>
+    </w:p>
+    <w:p>
+      <w:pPr>
+        <w:pStyle w:val="BlockCode"/>
+        <w:ind w:left="720"/>
+      </w:pPr>
+      <w:r>
+        <w:t>php-intl \</w:t>
+      </w:r>
+    </w:p>
+    <w:p>
+      <w:pPr>
+        <w:pStyle w:val="BlockCode"/>
+        <w:ind w:left="720"/>
+      </w:pPr>
+      <w:r>
+        <w:t>php-bz2 \</w:t>
+      </w:r>
+    </w:p>
+    <w:p>
+      <w:pPr>
+        <w:pStyle w:val="BlockCode"/>
+        <w:ind w:left="720"/>
+      </w:pPr>
+      <w:r>
+        <w:t>php-imap \</w:t>
+      </w:r>
+    </w:p>
+    <w:p>
+      <w:pPr>
+        <w:pStyle w:val="BlockCode"/>
+        <w:ind w:left="720"/>
+      </w:pPr>
+      <w:r>
+        <w:t>php-apcu \</w:t>
+      </w:r>
+    </w:p>
+    <w:p>
+      <w:pPr>
+        <w:pStyle w:val="BlockCode"/>
+        <w:ind w:left="720"/>
+      </w:pPr>
+      <w:r>
+        <w:t>php-ldap</w:t>
+      </w:r>
+      <w:r>
+        <w:t xml:space="preserve"> \</w:t>
+      </w:r>
+    </w:p>
+    <w:p>
+      <w:pPr>
+        <w:pStyle w:val="BlockCode"/>
+        <w:ind w:left="720"/>
+      </w:pPr>
+      <w:r>
+        <w:t>libapache2-mod-php</w:t>
+      </w:r>
+    </w:p>
+    <w:p/>
+    <w:p>
+      <w:r>
+        <w:rPr>
+          <w:b/>
+          <w:bCs/>
+        </w:rPr>
+        <w:t>Optimización de php.ini:</w:t>
+      </w:r>
+    </w:p>
+    <w:p>
+      <w:r>
+        <w:t>Edita</w:t>
+      </w:r>
+      <w:r>
+        <w:t>r</w:t>
+      </w:r>
+      <w:r>
+        <w:t xml:space="preserve"> el archivo (</w:t>
+      </w:r>
+      <w:r>
+        <w:rPr>
+          <w:b/>
+          <w:bCs/>
+          <w:i/>
+          <w:iCs/>
+        </w:rPr>
+        <w:t>/etc/php/8.3/apache2/php.ini</w:t>
+      </w:r>
+      <w:r>
+        <w:t>) y ajusta</w:t>
+      </w:r>
+      <w:r>
+        <w:t xml:space="preserve">r los siguientes </w:t>
+      </w:r>
+      <w:r>
+        <w:t>valores:</w:t>
+      </w:r>
+    </w:p>
+    <w:p>
+      <w:pPr>
+        <w:pStyle w:val="BlockCode"/>
+        <w:ind w:left="720"/>
+      </w:pPr>
+      <w:r>
+        <w:t>memory_limit = 256M</w:t>
+      </w:r>
+    </w:p>
+    <w:p>
+      <w:pPr>
+        <w:pStyle w:val="BlockCode"/>
+        <w:ind w:left="720"/>
+      </w:pPr>
+      <w:r>
+        <w:t>upload_max_filesize = 64M</w:t>
+      </w:r>
+    </w:p>
+    <w:p>
+      <w:pPr>
+        <w:pStyle w:val="BlockCode"/>
+        <w:ind w:left="720"/>
+      </w:pPr>
+      <w:r>
+        <w:t>date.timezone = America/Santiago</w:t>
+      </w:r>
+    </w:p>
+    <w:p>
+      <w:pPr>
+        <w:pStyle w:val="BlockCode"/>
+        <w:ind w:left="720"/>
+      </w:pPr>
+      <w:r>
+        <w:t>session.cookie_httponly = on</w:t>
+      </w:r>
+    </w:p>
+    <w:p/>
+    <w:p>
+      <w:pPr>
+        <w:rPr>
+          <w:b/>
+          <w:bCs/>
+        </w:rPr>
+      </w:pPr>
+      <w:r>
+        <w:rPr>
+          <w:b/>
+          <w:bCs/>
+        </w:rPr>
+        <w:t>3.4. Instalar Base de Datos (MariaDB)</w:t>
+      </w:r>
+    </w:p>
+    <w:p>
+      <w:pPr>
+        <w:pStyle w:val="BlockCode"/>
+        <w:ind w:firstLine="720"/>
+      </w:pPr>
+      <w:r>
+        <w:t>apt install</w:t>
+      </w:r>
+      <w:r>
+        <w:t xml:space="preserve"> </w:t>
+      </w:r>
+      <w:r>
+        <w:t>-y mariadb-server mariadb-client</w:t>
+      </w:r>
+    </w:p>
+    <w:p/>
+    <w:p/>
+    <w:p>
+      <w:pPr>
         <w:rPr>
           <w:rFonts w:ascii="Arial" w:hAnsi="Arial" w:cs="Arial"/>
           <w:b/>
@@ -774,249 +1175,8 @@
           <w:sz w:val="28"/>
           <w:szCs w:val="28"/>
         </w:rPr>
-        <w:t>Instalación de dependencias</w:t>
-      </w:r>
-    </w:p>
-    <w:p>
-      <w:pPr>
-        <w:rPr>
-          <w:b/>
-          <w:bCs/>
-        </w:rPr>
-      </w:pPr>
-    </w:p>
-    <w:p>
-      <w:pPr>
-        <w:rPr>
-          <w:b/>
-          <w:bCs/>
-        </w:rPr>
-      </w:pPr>
-      <w:r>
-        <w:rPr>
-          <w:b/>
-          <w:bCs/>
-        </w:rPr>
-        <w:t>3.1. Actualizar el sistema</w:t>
-      </w:r>
-    </w:p>
-    <w:p>
-      <w:pPr>
-        <w:pStyle w:val="Prrafodelista"/>
-        <w:numPr>
-          <w:ilvl w:val="0"/>
-          <w:numId w:val="9"/>
-        </w:numPr>
-      </w:pPr>
-      <w:r>
-        <w:t>sudo apt update &amp;&amp; sudo apt upgrade -</w:t>
-      </w:r>
-    </w:p>
-    <w:p>
-      <w:pPr>
-        <w:rPr>
-          <w:b/>
-          <w:bCs/>
-        </w:rPr>
-      </w:pPr>
-      <w:r>
-        <w:rPr>
-          <w:b/>
-          <w:bCs/>
-        </w:rPr>
-        <w:t>3.2. Instalar Apache</w:t>
-      </w:r>
-    </w:p>
-    <w:p>
-      <w:pPr>
-        <w:pStyle w:val="Prrafodelista"/>
-        <w:numPr>
-          <w:ilvl w:val="0"/>
-          <w:numId w:val="8"/>
-        </w:numPr>
-      </w:pPr>
-      <w:r>
-        <w:t>apt install apache2 -y</w:t>
-      </w:r>
-    </w:p>
-    <w:p>
-      <w:pPr>
-        <w:pStyle w:val="Prrafodelista"/>
-        <w:numPr>
-          <w:ilvl w:val="0"/>
-          <w:numId w:val="8"/>
-        </w:numPr>
-        <w:tabs>
-          <w:tab w:val="left" w:pos="916"/>
-          <w:tab w:val="left" w:pos="1832"/>
-          <w:tab w:val="left" w:pos="2748"/>
-          <w:tab w:val="left" w:pos="3664"/>
-          <w:tab w:val="left" w:pos="4580"/>
-          <w:tab w:val="left" w:pos="5496"/>
-          <w:tab w:val="left" w:pos="6412"/>
-          <w:tab w:val="left" w:pos="7328"/>
-          <w:tab w:val="left" w:pos="8244"/>
-          <w:tab w:val="left" w:pos="9160"/>
-          <w:tab w:val="left" w:pos="10076"/>
-          <w:tab w:val="left" w:pos="10992"/>
-          <w:tab w:val="left" w:pos="11908"/>
-          <w:tab w:val="left" w:pos="12824"/>
-          <w:tab w:val="left" w:pos="13740"/>
-          <w:tab w:val="left" w:pos="14656"/>
-        </w:tabs>
-        <w:wordWrap w:val="0"/>
-        <w:spacing w:after="0" w:line="330" w:lineRule="atLeast"/>
-      </w:pPr>
-      <w:r>
-        <w:t>systemctl enable apache2 &amp;&amp; systemctl start apache2</w:t>
-      </w:r>
-    </w:p>
-    <w:p>
-      <w:pPr>
-        <w:pStyle w:val="Prrafodelista"/>
-      </w:pPr>
-    </w:p>
-    <w:p>
-      <w:pPr>
-        <w:rPr>
-          <w:b/>
-          <w:bCs/>
-        </w:rPr>
-      </w:pPr>
-      <w:r>
-        <w:rPr>
-          <w:b/>
-          <w:bCs/>
-        </w:rPr>
-        <w:t>3.3. Instalar PHP y Extensiones</w:t>
-      </w:r>
-    </w:p>
-    <w:p>
-      <w:pPr>
-        <w:pStyle w:val="Prrafodelista"/>
-        <w:numPr>
-          <w:ilvl w:val="0"/>
-          <w:numId w:val="8"/>
-        </w:numPr>
-        <w:jc w:val="both"/>
-      </w:pPr>
-      <w:r>
-        <w:t>sudo apt install php php-cli php-common php-mysql php-zip php-gd php-mbstring php-curl php-xml php-intl php-bz2 php-imap php-apcu libapache2-mod-php -y</w:t>
-      </w:r>
-    </w:p>
-    <w:p>
-      <w:pPr>
-        <w:rPr>
-          <w:b/>
-          <w:bCs/>
-        </w:rPr>
-      </w:pPr>
-      <w:r>
-        <w:rPr>
-          <w:b/>
-          <w:bCs/>
-        </w:rPr>
-        <w:t>Optimización de php.ini:</w:t>
-      </w:r>
-    </w:p>
-    <w:p>
-      <w:r>
-        <w:br/>
-        <w:t>Edita</w:t>
-      </w:r>
-      <w:r>
-        <w:t>r</w:t>
-      </w:r>
-      <w:r>
-        <w:t xml:space="preserve"> el archivo (/etc/php/8.2/apache2/php.ini) y ajusta</w:t>
-      </w:r>
-      <w:r>
-        <w:t xml:space="preserve">l los </w:t>
-      </w:r>
-      <w:r>
-        <w:t xml:space="preserve">siguientes </w:t>
-      </w:r>
-      <w:r>
-        <w:t>valores</w:t>
-      </w:r>
-      <w:r>
-        <w:t>:</w:t>
-      </w:r>
-    </w:p>
-    <w:p>
-      <w:pPr>
-        <w:pStyle w:val="Prrafodelista"/>
-        <w:numPr>
-          <w:ilvl w:val="0"/>
-          <w:numId w:val="8"/>
-        </w:numPr>
-      </w:pPr>
-      <w:r>
-        <w:t>memory_limit = 256M</w:t>
-      </w:r>
-    </w:p>
-    <w:p>
-      <w:pPr>
-        <w:pStyle w:val="Prrafodelista"/>
-        <w:numPr>
-          <w:ilvl w:val="0"/>
-          <w:numId w:val="8"/>
-        </w:numPr>
-      </w:pPr>
-      <w:r>
-        <w:t>upload_max_filesize = 64M</w:t>
-      </w:r>
-    </w:p>
-    <w:p>
-      <w:pPr>
-        <w:pStyle w:val="Prrafodelista"/>
-        <w:numPr>
-          <w:ilvl w:val="0"/>
-          <w:numId w:val="8"/>
-        </w:numPr>
-      </w:pPr>
-      <w:r>
-        <w:t>date.timezone = America/Santiago</w:t>
-      </w:r>
-    </w:p>
-    <w:p>
-      <w:pPr>
-        <w:rPr>
-          <w:b/>
-          <w:bCs/>
-        </w:rPr>
-      </w:pPr>
-      <w:r>
-        <w:rPr>
-          <w:b/>
-          <w:bCs/>
-        </w:rPr>
-        <w:t>3.4. Instalar Base de Datos (MariaDB)</w:t>
-      </w:r>
-    </w:p>
-    <w:p>
-      <w:pPr>
-        <w:pStyle w:val="Prrafodelista"/>
-        <w:numPr>
-          <w:ilvl w:val="0"/>
-          <w:numId w:val="10"/>
-        </w:numPr>
-      </w:pPr>
-      <w:r>
-        <w:t>apt install mariadb-server mariadb-client -y</w:t>
-      </w:r>
-    </w:p>
-    <w:p>
-      <w:pPr>
-        <w:pStyle w:val="Prrafodelista"/>
-        <w:numPr>
-          <w:ilvl w:val="0"/>
-          <w:numId w:val="10"/>
-        </w:numPr>
-      </w:pPr>
-    </w:p>
-    <w:p>
-      <w:pPr>
+      </w:pPr>
+      <w:r>
         <w:rPr>
           <w:rFonts w:ascii="Arial" w:hAnsi="Arial" w:cs="Arial"/>
           <w:b/>
@@ -1024,8 +1184,113 @@
           <w:sz w:val="28"/>
           <w:szCs w:val="28"/>
         </w:rPr>
-      </w:pPr>
-      <w:r>
+        <w:lastRenderedPageBreak/>
+        <w:t>4. Descarga y Configuración de GLPI</w:t>
+      </w:r>
+    </w:p>
+    <w:p>
+      <w:pPr>
+        <w:rPr>
+          <w:b/>
+          <w:bCs/>
+        </w:rPr>
+      </w:pPr>
+      <w:r>
+        <w:rPr>
+          <w:b/>
+          <w:bCs/>
+        </w:rPr>
+        <w:t>4.1. Descargar el paquete</w:t>
+      </w:r>
+    </w:p>
+    <w:p>
+      <w:pPr>
+        <w:pStyle w:val="BlockCode"/>
+        <w:ind w:left="720"/>
+      </w:pPr>
+      <w:r>
+        <w:t xml:space="preserve">wget </w:t>
+      </w:r>
+      <w:hyperlink r:id="rId9" w:history="1">
+        <w:r>
+          <w:rPr>
+            <w:rStyle w:val="Hyperlink"/>
+          </w:rPr>
+          <w:t>https://github.com/glpi-project/glpi/releases/download/10.0.15/glpi-10.0.15.tgz</w:t>
+        </w:r>
+      </w:hyperlink>
+    </w:p>
+    <w:p/>
+    <w:p>
+      <w:pPr>
+        <w:rPr>
+          <w:b/>
+          <w:bCs/>
+        </w:rPr>
+      </w:pPr>
+      <w:r>
+        <w:rPr>
+          <w:b/>
+          <w:bCs/>
+        </w:rPr>
+        <w:t>4.2. Descomprimir en el directorio web</w:t>
+      </w:r>
+    </w:p>
+    <w:p>
+      <w:pPr>
+        <w:pStyle w:val="BlockCode"/>
+        <w:ind w:firstLine="720"/>
+      </w:pPr>
+      <w:r>
+        <w:t>tar -xzvf glpi-*.tgz -C /var/www/html/</w:t>
+      </w:r>
+    </w:p>
+    <w:p/>
+    <w:p>
+      <w:pPr>
+        <w:rPr>
+          <w:b/>
+          <w:bCs/>
+        </w:rPr>
+      </w:pPr>
+      <w:r>
+        <w:rPr>
+          <w:b/>
+          <w:bCs/>
+        </w:rPr>
+        <w:t>4.3. Cambiar usuario y grupo propietario de /var/www/html/glpi</w:t>
+      </w:r>
+    </w:p>
+    <w:p>
+      <w:pPr>
+        <w:pStyle w:val="BlockCode"/>
+        <w:ind w:firstLine="720"/>
+        <w:rPr>
+          <w:lang w:val="en-US"/>
+        </w:rPr>
+      </w:pPr>
+      <w:r>
+        <w:rPr>
+          <w:lang w:val="en-US"/>
+        </w:rPr>
+        <w:t xml:space="preserve">chown -R www-data:www-data </w:t>
+      </w:r>
+      <w:r>
+        <w:rPr>
+          <w:lang w:val="en-US"/>
+        </w:rPr>
+        <w:t>/var/www/html/glpi</w:t>
+      </w:r>
+      <w:r>
+        <w:rPr>
+          <w:lang w:val="en-US"/>
+        </w:rPr>
+        <w:t>/</w:t>
+      </w:r>
+    </w:p>
+    <w:p/>
+    <w:p>
+      <w:pPr>
         <w:rPr>
           <w:rFonts w:ascii="Arial" w:hAnsi="Arial" w:cs="Arial"/>
           <w:b/>
@@ -1033,85 +1298,8 @@
           <w:sz w:val="28"/>
           <w:szCs w:val="28"/>
         </w:rPr>
-        <w:t>4. Descarga y Configuración de GLPI</w:t>
-      </w:r>
-    </w:p>
-    <w:p>
-      <w:pPr>
-        <w:rPr>
-          <w:b/>
-          <w:bCs/>
-        </w:rPr>
-      </w:pPr>
-    </w:p>
-    <w:p>
-      <w:pPr>
-        <w:rPr>
-          <w:b/>
-          <w:bCs/>
-        </w:rPr>
-      </w:pPr>
-      <w:r>
-        <w:rPr>
-          <w:b/>
-          <w:bCs/>
-        </w:rPr>
-        <w:t>4.1. Descargar el paquete</w:t>
-      </w:r>
-    </w:p>
-    <w:p>
-      <w:pPr>
-        <w:pStyle w:val="Prrafodelista"/>
-        <w:numPr>
-          <w:ilvl w:val="0"/>
-          <w:numId w:val="10"/>
-        </w:numPr>
-      </w:pPr>
-      <w:r>
-        <w:t>https://github.com/glpi-project/glpi/releases/download/10.0.15/glpi-10.0.15.tgz</w:t>
-      </w:r>
-    </w:p>
-    <w:p>
-      <w:pPr>
-        <w:rPr>
-          <w:b/>
-          <w:bCs/>
-        </w:rPr>
-      </w:pPr>
-      <w:r>
-        <w:rPr>
-          <w:b/>
-          <w:bCs/>
-        </w:rPr>
-        <w:t>4.2. Descomprimir en el directorio web</w:t>
-      </w:r>
-    </w:p>
-    <w:p>
-      <w:pPr>
-        <w:pStyle w:val="Prrafodelista"/>
-        <w:numPr>
-          <w:ilvl w:val="0"/>
-          <w:numId w:val="10"/>
-        </w:numPr>
-      </w:pPr>
-      <w:r>
-        <w:t>tar -xzvf glpi-*.tgz -C /var/www/html/</w:t>
-      </w:r>
-    </w:p>
-    <w:p>
-      <w:pPr>
-        <w:pStyle w:val="Prrafodelista"/>
-        <w:numPr>
-          <w:ilvl w:val="0"/>
-          <w:numId w:val="10"/>
-        </w:numPr>
-      </w:pPr>
-      <w:r>
-        <w:t>cd /var/www/html/</w:t>
-      </w:r>
-    </w:p>
-    <w:p>
-      <w:pPr>
+      </w:pPr>
+      <w:r>
         <w:rPr>
           <w:rFonts w:ascii="Arial" w:hAnsi="Arial" w:cs="Arial"/>
           <w:b/>
@@ -1119,8 +1307,209 @@
           <w:sz w:val="28"/>
           <w:szCs w:val="28"/>
         </w:rPr>
-      </w:pPr>
-      <w:r>
+        <w:t>5. Configuración de Apache</w:t>
+      </w:r>
+    </w:p>
+    <w:p>
+      <w:pPr>
+        <w:rPr>
+          <w:b/>
+          <w:bCs/>
+        </w:rPr>
+      </w:pPr>
+      <w:r>
+        <w:rPr>
+          <w:b/>
+          <w:bCs/>
+        </w:rPr>
+        <w:t>Creación de un Virtual Host dedicado.</w:t>
+      </w:r>
+    </w:p>
+    <w:p>
+      <w:r>
+        <w:t>Crear el archivo de configuración</w:t>
+      </w:r>
+      <w:r>
+        <w:t xml:space="preserve"> </w:t>
+      </w:r>
+      <w:r>
+        <w:rPr>
+          <w:b/>
+          <w:bCs/>
+          <w:i/>
+          <w:iCs/>
+        </w:rPr>
+        <w:t xml:space="preserve">/etc/apache2/sites-available/glpi.conf </w:t>
+      </w:r>
+      <w:r>
+        <w:t>con el siguiente contenido:</w:t>
+      </w:r>
+    </w:p>
+    <w:p>
+      <w:pPr>
+        <w:pStyle w:val="BlockCode"/>
+        <w:ind w:left="720"/>
+      </w:pPr>
+      <w:r>
+        <w:t>&lt;VirtualHost *:80&gt;</w:t>
+      </w:r>
+    </w:p>
+    <w:p>
+      <w:pPr>
+        <w:pStyle w:val="BlockCode"/>
+        <w:ind w:left="720"/>
+      </w:pPr>
+      <w:r>
+        <w:t xml:space="preserve">    DocumentRoot /var/www/html/glpi/public</w:t>
+      </w:r>
+    </w:p>
+    <w:p>
+      <w:pPr>
+        <w:pStyle w:val="BlockCode"/>
+        <w:ind w:left="720"/>
+      </w:pPr>
+      <w:r>
+        <w:t xml:space="preserve">    &lt;Directory /var/www/html/glpi/public&gt;</w:t>
+      </w:r>
+    </w:p>
+    <w:p>
+      <w:pPr>
+        <w:pStyle w:val="BlockCode"/>
+        <w:ind w:left="720"/>
+      </w:pPr>
+      <w:r>
+        <w:t xml:space="preserve">        Require all granted</w:t>
+      </w:r>
+    </w:p>
+    <w:p>
+      <w:pPr>
+        <w:pStyle w:val="BlockCode"/>
+        <w:ind w:left="720"/>
+      </w:pPr>
+      <w:r>
+        <w:t xml:space="preserve">        RewriteEngine On  </w:t>
+      </w:r>
+    </w:p>
+    <w:p>
+      <w:pPr>
+        <w:pStyle w:val="BlockCode"/>
+        <w:ind w:left="720"/>
+      </w:pPr>
+      <w:r>
+        <w:t xml:space="preserve">        # Redirigir todo al index.php (para URLs amigables)</w:t>
+      </w:r>
+    </w:p>
+    <w:p>
+      <w:pPr>
+        <w:pStyle w:val="BlockCode"/>
+        <w:ind w:left="720"/>
+      </w:pPr>
+      <w:r>
+        <w:t xml:space="preserve">        RewriteCond %{REQUEST_FILENAME} !-f</w:t>
+      </w:r>
+    </w:p>
+    <w:p>
+      <w:pPr>
+        <w:pStyle w:val="BlockCode"/>
+        <w:ind w:left="720"/>
+      </w:pPr>
+      <w:r>
+        <w:t xml:space="preserve">        RewriteRule ^(.*)$ index.php [QSA,L]</w:t>
+      </w:r>
+    </w:p>
+    <w:p>
+      <w:pPr>
+        <w:pStyle w:val="BlockCode"/>
+        <w:ind w:left="720"/>
+      </w:pPr>
+      <w:r>
+        <w:t xml:space="preserve">    &lt;/Directory&gt;</w:t>
+      </w:r>
+    </w:p>
+    <w:p>
+      <w:pPr>
+        <w:pStyle w:val="BlockCode"/>
+        <w:ind w:left="720"/>
+      </w:pPr>
+      <w:r>
+        <w:t xml:space="preserve">    ErrorLog ${APACHE_LOG_DIR}/glpi_error.log</w:t>
+      </w:r>
+    </w:p>
+    <w:p>
+      <w:pPr>
+        <w:pStyle w:val="BlockCode"/>
+        <w:ind w:left="720"/>
+      </w:pPr>
+      <w:r>
+        <w:t xml:space="preserve">    CustomLog ${APACHE_LOG_DIR}/glpi_access.log combined</w:t>
+      </w:r>
+    </w:p>
+    <w:p>
+      <w:pPr>
+        <w:pStyle w:val="BlockCode"/>
+        <w:ind w:left="720"/>
+      </w:pPr>
+      <w:r>
+        <w:t>&lt;/VirtualHost&gt;</w:t>
+      </w:r>
+    </w:p>
+    <w:p/>
+    <w:p>
+      <w:pPr>
+        <w:rPr>
+          <w:b/>
+          <w:bCs/>
+        </w:rPr>
+      </w:pPr>
+      <w:r>
+        <w:rPr>
+          <w:b/>
+          <w:bCs/>
+        </w:rPr>
+        <w:t>Habilitar el sitio y módulos necesarios:</w:t>
+      </w:r>
+    </w:p>
+    <w:p>
+      <w:pPr>
+        <w:pStyle w:val="BlockCode"/>
+        <w:ind w:left="720"/>
+      </w:pPr>
+      <w:r>
+        <w:t>a2ensite glpi.conf</w:t>
+      </w:r>
+    </w:p>
+    <w:p>
+      <w:pPr>
+        <w:pStyle w:val="BlockCode"/>
+        <w:ind w:left="720"/>
+      </w:pPr>
+      <w:r>
+        <w:t xml:space="preserve">a2dissite 000-default.conf </w:t>
+      </w:r>
+    </w:p>
+    <w:p>
+      <w:pPr>
+        <w:pStyle w:val="BlockCode"/>
+        <w:ind w:left="720"/>
+      </w:pPr>
+      <w:r>
+        <w:t>a2enmod rewrite</w:t>
+      </w:r>
+    </w:p>
+    <w:p>
+      <w:pPr>
+        <w:pStyle w:val="BlockCode"/>
+        <w:ind w:left="720"/>
+      </w:pPr>
+      <w:r>
+        <w:t>systemctl restart apache2</w:t>
+      </w:r>
+    </w:p>
+    <w:p/>
+    <w:p/>
+    <w:p/>
+    <w:p>
+      <w:pPr>
         <w:rPr>
           <w:rFonts w:ascii="Arial" w:hAnsi="Arial" w:cs="Arial"/>
           <w:b/>
@@ -1128,200 +1517,8 @@
           <w:sz w:val="28"/>
           <w:szCs w:val="28"/>
         </w:rPr>
-        <w:t>5. Configuración de Apache</w:t>
-      </w:r>
-    </w:p>
-    <w:p>
-      <w:pPr>
-        <w:rPr>
-          <w:b/>
-          <w:bCs/>
-        </w:rPr>
-      </w:pPr>
-      <w:r>
-        <w:rPr>
-          <w:b/>
-          <w:bCs/>
-        </w:rPr>
-        <w:t>Creación</w:t>
-      </w:r>
-      <w:r>
-        <w:rPr>
-          <w:b/>
-          <w:bCs/>
-        </w:rPr>
-        <w:t xml:space="preserve"> </w:t>
-      </w:r>
-      <w:r>
-        <w:rPr>
-          <w:b/>
-          <w:bCs/>
-        </w:rPr>
-        <w:t xml:space="preserve">de un </w:t>
-      </w:r>
-      <w:r>
-        <w:rPr>
-          <w:b/>
-          <w:bCs/>
-        </w:rPr>
-        <w:t>Virtual Host dedicado</w:t>
-      </w:r>
-      <w:r>
-        <w:rPr>
-          <w:b/>
-          <w:bCs/>
-        </w:rPr>
-        <w:t>.</w:t>
-      </w:r>
-    </w:p>
-    <w:p>
-      <w:pPr>
-        <w:pStyle w:val="Prrafodelista"/>
-        <w:numPr>
-          <w:ilvl w:val="0"/>
-          <w:numId w:val="13"/>
-        </w:numPr>
-      </w:pPr>
-      <w:r>
-        <w:t>Crear el archivo de configuración:</w:t>
-      </w:r>
-    </w:p>
-    <w:p>
-      <w:pPr>
-        <w:pStyle w:val="Prrafodelista"/>
-        <w:numPr>
-          <w:ilvl w:val="1"/>
-          <w:numId w:val="13"/>
-        </w:numPr>
-      </w:pPr>
-      <w:r>
-        <w:t>nano /etc/apache2/sites-available/glpi.conf</w:t>
-      </w:r>
-    </w:p>
-    <w:p/>
-    <w:p/>
-    <w:p>
-      <w:pPr>
-        <w:rPr>
-          <w:b/>
-          <w:bCs/>
-        </w:rPr>
-      </w:pPr>
-      <w:r>
-        <w:rPr>
-          <w:b/>
-          <w:bCs/>
-        </w:rPr>
-        <w:lastRenderedPageBreak/>
-        <w:t>Contenido del Archivo a editar</w:t>
-      </w:r>
-    </w:p>
-    <w:p>
-      <w:r>
-        <w:t>&lt;VirtualHost *:80&gt;</w:t>
-      </w:r>
-    </w:p>
-    <w:p>
-      <w:r>
-        <w:t xml:space="preserve">    ServerName </w:t>
-      </w:r>
-      <w:r>
-        <w:t>172.16.36.23</w:t>
-      </w:r>
-    </w:p>
-    <w:p>
-      <w:r>
-        <w:t xml:space="preserve">    DocumentRoot /var/www/html/glpi/public</w:t>
-      </w:r>
-    </w:p>
-    <w:p>
-      <w:r>
-        <w:t xml:space="preserve">    &lt;Directory /var/www/html/glpi/public&gt;</w:t>
-      </w:r>
-    </w:p>
-    <w:p>
-      <w:r>
-        <w:t xml:space="preserve">        Require all granted</w:t>
-      </w:r>
-    </w:p>
-    <w:p>
-      <w:r>
-        <w:t xml:space="preserve">        RewriteEngine On  </w:t>
-      </w:r>
-    </w:p>
-    <w:p>
-      <w:r>
-        <w:t xml:space="preserve">        # Redirigir todo al index.php (para URLs amigables)</w:t>
-      </w:r>
-    </w:p>
-    <w:p>
-      <w:r>
-        <w:t xml:space="preserve">        RewriteCond %{REQUEST_FILENAME} !-f</w:t>
-      </w:r>
-    </w:p>
-    <w:p>
-      <w:r>
-        <w:t xml:space="preserve">        RewriteRule ^(.*)$ index.php [QSA,L]</w:t>
-      </w:r>
-    </w:p>
-    <w:p>
-      <w:r>
-        <w:t xml:space="preserve">    &lt;/Directory&gt;</w:t>
-      </w:r>
-    </w:p>
-    <w:p>
-      <w:r>
-        <w:t xml:space="preserve">    ErrorLog ${APACHE_LOG_DIR}/glpi_error.log</w:t>
-      </w:r>
-    </w:p>
-    <w:p>
-      <w:r>
-        <w:t xml:space="preserve">    CustomLog ${APACHE_LOG_DIR}/glpi_access.log combined</w:t>
-      </w:r>
-    </w:p>
-    <w:p>
-      <w:r>
-        <w:t>&lt;/VirtualHost&gt;</w:t>
-      </w:r>
-    </w:p>
-    <w:p>
-      <w:pPr>
-        <w:rPr>
-          <w:b/>
-          <w:bCs/>
-        </w:rPr>
-      </w:pPr>
-      <w:r>
-        <w:rPr>
-          <w:b/>
-          <w:bCs/>
-        </w:rPr>
-        <w:t>Habilitar el sitio y módulos necesarios:</w:t>
-      </w:r>
-    </w:p>
-    <w:p>
-      <w:r>
-        <w:t>a2ensite glpi.conf</w:t>
-      </w:r>
-    </w:p>
-    <w:p>
-      <w:r>
-        <w:t xml:space="preserve">a2dissite 000-default.conf </w:t>
-      </w:r>
-    </w:p>
-    <w:p>
-      <w:r>
-        <w:t>a2enmod rewrite</w:t>
-      </w:r>
-    </w:p>
-    <w:p>
-      <w:r>
-        <w:t>systemctl restart apache2</w:t>
-      </w:r>
-    </w:p>
-    <w:p/>
-    <w:p>
-      <w:pPr>
+      </w:pPr>
+      <w:r>
         <w:rPr>
           <w:rFonts w:ascii="Arial" w:hAnsi="Arial" w:cs="Arial"/>
           <w:b/>
@@ -1329,128 +1526,97 @@
           <w:sz w:val="28"/>
           <w:szCs w:val="28"/>
         </w:rPr>
-      </w:pPr>
-      <w:r>
-        <w:rPr>
-          <w:rFonts w:ascii="Arial" w:hAnsi="Arial" w:cs="Arial"/>
-          <w:b/>
-          <w:bCs/>
-          <w:sz w:val="28"/>
-          <w:szCs w:val="28"/>
-        </w:rPr>
+        <w:lastRenderedPageBreak/>
         <w:t>6. Preparación de la Base de Datos</w:t>
       </w:r>
     </w:p>
     <w:p>
       <w:pPr>
         <w:rPr>
-          <w:rFonts w:ascii="Arial" w:hAnsi="Arial" w:cs="Arial"/>
-          <w:b/>
-          <w:bCs/>
-          <w:sz w:val="28"/>
-          <w:szCs w:val="28"/>
-        </w:rPr>
-      </w:pPr>
-    </w:p>
-    <w:p>
-      <w:pPr>
-        <w:rPr>
-          <w:b/>
-          <w:bCs/>
-        </w:rPr>
-      </w:pPr>
-      <w:r>
-        <w:rPr>
-          <w:b/>
-          <w:bCs/>
-        </w:rPr>
-        <w:t>Conectarse</w:t>
-      </w:r>
-      <w:r>
-        <w:rPr>
-          <w:b/>
-          <w:bCs/>
-        </w:rPr>
-        <w:t xml:space="preserve"> a MariaDB para crear la base de datos y el usuario</w:t>
-      </w:r>
-      <w:r>
-        <w:rPr>
-          <w:b/>
-          <w:bCs/>
-        </w:rPr>
-        <w:t xml:space="preserve"> administrador</w:t>
-      </w:r>
-      <w:r>
-        <w:rPr>
-          <w:b/>
-          <w:bCs/>
-        </w:rPr>
-        <w:t>:</w:t>
-      </w:r>
-    </w:p>
-    <w:p>
-      <w:pPr>
-        <w:pStyle w:val="Prrafodelista"/>
-        <w:numPr>
-          <w:ilvl w:val="0"/>
-          <w:numId w:val="14"/>
-        </w:numPr>
+          <w:b/>
+          <w:bCs/>
+        </w:rPr>
+      </w:pPr>
+      <w:r>
+        <w:rPr>
+          <w:b/>
+          <w:bCs/>
+        </w:rPr>
+        <w:t>Conectarse a MariaDB para crear la base de datos y el usuario administrador:</w:t>
+      </w:r>
+    </w:p>
+    <w:p>
+      <w:pPr>
+        <w:pStyle w:val="BlockCode"/>
+        <w:ind w:firstLine="720"/>
       </w:pPr>
       <w:r>
         <w:t>mysql -u root -p</w:t>
       </w:r>
     </w:p>
-    <w:p>
-      <w:pPr>
-        <w:rPr>
-          <w:b/>
-          <w:bCs/>
-        </w:rPr>
-      </w:pPr>
-      <w:r>
-        <w:rPr>
-          <w:b/>
-          <w:bCs/>
-        </w:rPr>
-        <w:t>Se e</w:t>
-      </w:r>
-      <w:r>
-        <w:rPr>
-          <w:b/>
-          <w:bCs/>
-        </w:rPr>
-        <w:t>jecuta los siguientes comandos SQL</w:t>
-      </w:r>
-    </w:p>
     <w:p/>
     <w:p>
-      <w:r>
-        <w:lastRenderedPageBreak/>
+      <w:pPr>
+        <w:rPr>
+          <w:b/>
+          <w:bCs/>
+        </w:rPr>
+      </w:pPr>
+      <w:r>
+        <w:rPr>
+          <w:b/>
+          <w:bCs/>
+        </w:rPr>
+        <w:t>Se ejecuta los siguientes comandos SQL</w:t>
+      </w:r>
+    </w:p>
+    <w:p>
+      <w:pPr>
+        <w:pStyle w:val="BlockCode"/>
+        <w:ind w:left="720"/>
+      </w:pPr>
+      <w:r>
         <w:t>CREATE USER 'glpiuser'@'localhost' IDENTIFIED BY '</w:t>
       </w:r>
       <w:r>
         <w:t>*********</w:t>
       </w:r>
       <w:r>
-        <w:t>;</w:t>
-      </w:r>
-    </w:p>
-    <w:p>
+        <w:t>';</w:t>
+      </w:r>
+    </w:p>
+    <w:p>
+      <w:pPr>
+        <w:pStyle w:val="BlockCode"/>
+        <w:ind w:left="720"/>
+      </w:pPr>
       <w:r>
         <w:t>CREATE DATABASE glpi_db CHARACTER SET utf8mb4 COLLATE utf8mb4_unicode_ci;</w:t>
       </w:r>
     </w:p>
     <w:p>
+      <w:pPr>
+        <w:pStyle w:val="BlockCode"/>
+        <w:ind w:left="720"/>
+      </w:pPr>
       <w:r>
         <w:t>GRANT ALL PRIVILEGES ON glpi_db.* TO 'glpiuser'@'localhost';</w:t>
       </w:r>
     </w:p>
     <w:p>
+      <w:pPr>
+        <w:pStyle w:val="BlockCode"/>
+        <w:ind w:left="720"/>
+      </w:pPr>
       <w:r>
         <w:t>FLUSH PRIVILEGES;</w:t>
       </w:r>
     </w:p>
     <w:p>
+      <w:pPr>
+        <w:pStyle w:val="BlockCode"/>
+        <w:ind w:left="720"/>
+      </w:pPr>
       <w:r>
         <w:t>EXIT;</w:t>
       </w:r>
@@ -1497,7 +1663,16 @@
         <w:t>y colocar</w:t>
       </w:r>
       <w:r>
-        <w:t xml:space="preserve"> http://172.16.36.23</w:t>
+        <w:t xml:space="preserve"> </w:t>
+      </w:r>
+      <w:r>
+        <w:rPr>
+          <w:b/>
+          <w:bCs/>
+          <w:i/>
+          <w:iCs/>
+        </w:rPr>
+        <w:t>http://172.16.36.23</w:t>
       </w:r>
       <w:r>
         <w:t>.</w:t>
@@ -1521,10 +1696,34 @@
         <w:t xml:space="preserve"> Selecciona </w:t>
       </w:r>
       <w:r>
-        <w:t>“Español”</w:t>
-      </w:r>
-      <w:r>
-        <w:t xml:space="preserve"> y haz clic en "OK".</w:t>
+        <w:t>“</w:t>
+      </w:r>
+      <w:r>
+        <w:rPr>
+          <w:b/>
+          <w:bCs/>
+          <w:i/>
+          <w:iCs/>
+        </w:rPr>
+        <w:t>Español (America Latina)</w:t>
+      </w:r>
+      <w:r>
+        <w:t>”</w:t>
+      </w:r>
+      <w:r>
+        <w:t xml:space="preserve"> y haz clic en "</w:t>
+      </w:r>
+      <w:r>
+        <w:rPr>
+          <w:b/>
+          <w:bCs/>
+          <w:i/>
+          <w:iCs/>
+        </w:rPr>
+        <w:t>OK</w:t>
+      </w:r>
+      <w:r>
+        <w:t>".</w:t>
       </w:r>
     </w:p>
     <w:p>
@@ -1542,7 +1741,19 @@
         <w:t>Licencia:</w:t>
       </w:r>
       <w:r>
-        <w:t> Acepta la licencia GNU GPL y haz clic en "Continuar".</w:t>
+        <w:t> Acepta la licencia GNU GPL y haz clic en "</w:t>
+      </w:r>
+      <w:r>
+        <w:rPr>
+          <w:b/>
+          <w:bCs/>
+          <w:i/>
+          <w:iCs/>
+        </w:rPr>
+        <w:t>Continuar</w:t>
+      </w:r>
+      <w:r>
+        <w:t>".</w:t>
       </w:r>
     </w:p>
     <w:p>
@@ -1560,7 +1771,31 @@
         <w:t>Verificación de requisitos:</w:t>
       </w:r>
       <w:r>
-        <w:t> Asegúrate de que todos los check estén en verde. Si falta algún permiso, verifica los permisos de la carpeta /var/www/html/glpi/files. Haz clic en "Continuar".</w:t>
+        <w:t> Asegúrate de que todos los check estén en verde. Si falta algún permiso, verifica los permisos de la carpeta </w:t>
+      </w:r>
+      <w:r>
+        <w:rPr>
+          <w:b/>
+          <w:bCs/>
+          <w:i/>
+          <w:iCs/>
+        </w:rPr>
+        <w:t>/var/www/html/glpi</w:t>
+      </w:r>
+      <w:r>
+        <w:t>. Haz clic en "</w:t>
+      </w:r>
+      <w:r>
+        <w:rPr>
+          <w:b/>
+          <w:bCs/>
+          <w:i/>
+          <w:iCs/>
+        </w:rPr>
+        <w:t>Continuar</w:t>
+      </w:r>
+      <w:r>
+        <w:t>".</w:t>
       </w:r>
     </w:p>
     <w:p>
@@ -1653,7 +1888,19 @@
         <w:t>Selección de DB:</w:t>
       </w:r>
       <w:r>
-        <w:t> Selecciona glpi_db.</w:t>
+        <w:t> Selecciona </w:t>
+      </w:r>
+      <w:r>
+        <w:rPr>
+          <w:b/>
+          <w:bCs/>
+          <w:i/>
+          <w:iCs/>
+        </w:rPr>
+        <w:t>glpi_db</w:t>
+      </w:r>
+      <w:r>
+        <w:t>.</w:t>
       </w:r>
     </w:p>
     <w:p>
@@ -1750,7 +1997,7 @@
                     <pic:cNvPicPr/>
                   </pic:nvPicPr>
                   <pic:blipFill>
-                    <a:blip r:embed="rId9"/>
+                    <a:blip r:embed="rId10"/>
                     <a:stretch>
                       <a:fillRect/>
                     </a:stretch>
@@ -1774,6 +2021,9 @@
     <w:p/>
     <w:p>
       <w:r>
+        <w:rPr>
+          <w:noProof/>
+        </w:rPr>
         <w:drawing>
           <wp:inline distT="0" distB="0" distL="0" distR="0" wp14:anchorId="164E16DF" wp14:editId="5087D347">
             <wp:extent cx="5612130" cy="2816225"/>
@@ -1790,7 +2040,7 @@
                     <pic:cNvPicPr/>
                   </pic:nvPicPr>
                   <pic:blipFill>
-                    <a:blip r:embed="rId10"/>
+                    <a:blip r:embed="rId11"/>
                     <a:stretch>
                       <a:fillRect/>
                     </a:stretch>
@@ -1813,7 +2063,7 @@
     </w:p>
     <w:p/>
     <w:sectPr>
-      <w:headerReference w:type="default" r:id="rId11"/>
+      <w:headerReference w:type="default" r:id="rId12"/>
       <w:pgSz w:w="12240" w:h="15840"/>
       <w:pgMar w:top="1417" w:right="1701" w:bottom="1417" w:left="1701" w:header="708" w:footer="708" w:gutter="0"/>
       <w:cols w:space="708"/>
@@ -1824,7 +2074,7 @@
 </file>
 
 <file path=word/endnotes.xml><?xml version="1.0" encoding="utf-8"?>
-<w:endnotes xmlns:wpc="http://schemas.microsoft.com/office/word/2010/wordprocessingCanvas" xmlns:cx="http://schemas.microsoft.com/office/drawing/2014/chartex" xmlns:cx1="http://schemas.microsoft.com/office/drawing/2015/9/8/chartex" xmlns:cx2="http://schemas.microsoft.com/office/drawing/2015/10/21/chartex" xmlns:cx3="http://schemas.microsoft.com/office/drawing/2016/5/9/chartex" xmlns:cx4="http://schemas.microsoft.com/office/drawing/2016/5/10/chartex" xmlns:cx5="http://schemas.microsoft.com/office/drawing/2016/5/11/chartex" xmlns:cx6="http://schemas.microsoft.com/office/drawing/2016/5/12/chartex" xmlns:cx7="http://schemas.microsoft.com/office/drawing/2016/5/13/chartex" xmlns:cx8="http://schemas.microsoft.com/office/drawing/2016/5/14/chartex" xmlns:mc="http://schemas.openxmlformats.org/markup-compatibility/2006" xmlns:aink="http://schemas.microsoft.com/office/drawing/2016/ink" xmlns:am3d="http://schemas.microsoft.com/office/drawing/2017/model3d" xmlns:o="urn:schemas-microsoft-com:office:office" xmlns:oel="http://schemas.microsoft.com/office/2019/extlst" xmlns:r="http://schemas.openxmlformats.org/officeDocument/2006/relationships" xmlns:m="http://schemas.openxmlformats.org/officeDocument/2006/math" xmlns:v="urn:schemas-microsoft-com:vml" xmlns:wp14="http://schemas.microsoft.com/office/word/2010/wordprocessingDrawing" xmlns:wp="http://schemas.openxmlformats.org/drawingml/2006/wordprocessingDrawing" xmlns:w10="urn:schemas-microsoft-com:office:word" xmlns:w="http://schemas.openxmlformats.org/wordprocessingml/2006/main" xmlns:w14="http://schemas.microsoft.com/office/word/2010/wordml" xmlns:w15="http://schemas.microsoft.com/office/word/2012/wordml" xmlns:w16cex="http://schemas.microsoft.com/office/word/2018/wordml/cex" xmlns:w16cid="http://schemas.microsoft.com/office/word/2016/wordml/cid" xmlns:w16="http://schemas.microsoft.com/office/word/2018/wordml" xmlns:w16du="http://schemas.microsoft.com/office/word/2023/wordml/word16du" xmlns:w16sdtdh="http://schemas.microsoft.com/office/word/2020/wordml/sdtdatahash" xmlns:w16sdtfl="http://schemas.microsoft.com/office/word/2024/wordml/sdtformatlock" xmlns:w16se="http://schemas.microsoft.com/office/word/2015/wordml/symex" xmlns:wpg="http://schemas.microsoft.com/office/word/2010/wordprocessingGroup" xmlns:wpi="http://schemas.microsoft.com/office/word/2010/wordprocessingInk" xmlns:wne="http://schemas.microsoft.com/office/word/2006/wordml" xmlns:wps="http://schemas.microsoft.com/office/word/2010/wordprocessingShape" mc:Ignorable="w14 w15 w16se w16cid w16 w16cex w16sdtdh w16sdtfl w16du wp14">
+<w:endnotes xmlns:wpc="http://schemas.microsoft.com/office/word/2010/wordprocessingCanvas" xmlns:cx="http://schemas.microsoft.com/office/drawing/2014/chartex" xmlns:cx1="http://schemas.microsoft.com/office/drawing/2015/9/8/chartex" xmlns:cx2="http://schemas.microsoft.com/office/drawing/2015/10/21/chartex" xmlns:cx3="http://schemas.microsoft.com/office/drawing/2016/5/9/chartex" xmlns:cx4="http://schemas.microsoft.com/office/drawing/2016/5/10/chartex" xmlns:cx5="http://schemas.microsoft.com/office/drawing/2016/5/11/chartex" xmlns:cx6="http://schemas.microsoft.com/office/drawing/2016/5/12/chartex" xmlns:cx7="http://schemas.microsoft.com/office/drawing/2016/5/13/chartex" xmlns:cx8="http://schemas.microsoft.com/office/drawing/2016/5/14/chartex" xmlns:mc="http://schemas.openxmlformats.org/markup-compatibility/2006" xmlns:aink="http://schemas.microsoft.com/office/drawing/2016/ink" xmlns:am3d="http://schemas.microsoft.com/office/drawing/2017/model3d" xmlns:o="urn:schemas-microsoft-com:office:office" xmlns:oel="http://schemas.microsoft.com/office/2019/extlst" xmlns:r="http://schemas.openxmlformats.org/officeDocument/2006/relationships" xmlns:m="http://schemas.openxmlformats.org/officeDocument/2006/math" xmlns:v="urn:schemas-microsoft-com:vml" xmlns:wp14="http://schemas.microsoft.com/office/word/2010/wordprocessingDrawing" xmlns:wp="http://schemas.openxmlformats.org/drawingml/2006/wordprocessingDrawing" xmlns:w10="urn:schemas-microsoft-com:office:word" xmlns:w="http://schemas.openxmlformats.org/wordprocessingml/2006/main" xmlns:w14="http://schemas.microsoft.com/office/word/2010/wordml" xmlns:w15="http://schemas.microsoft.com/office/word/2012/wordml" xmlns:w16cex="http://schemas.microsoft.com/office/word/2018/wordml/cex" xmlns:w16cid="http://schemas.microsoft.com/office/word/2016/wordml/cid" xmlns:w16="http://schemas.microsoft.com/office/word/2018/wordml" xmlns:w16du="http://schemas.microsoft.com/office/word/2023/wordml/word16du" xmlns:w16sdtdh="http://schemas.microsoft.com/office/word/2020/wordml/sdtdatahash" xmlns:w16se="http://schemas.microsoft.com/office/word/2015/wordml/symex" xmlns:wpg="http://schemas.microsoft.com/office/word/2010/wordprocessingGroup" xmlns:wpi="http://schemas.microsoft.com/office/word/2010/wordprocessingInk" xmlns:wne="http://schemas.microsoft.com/office/word/2006/wordml" xmlns:wps="http://schemas.microsoft.com/office/word/2010/wordprocessingShape" mc:Ignorable="w14 w15 w16se w16cid w16 w16cex w16sdtdh w16du wp14">
   <w:endnote w:type="separator" w:id="-1">
     <w:p>
       <w:pPr>
@@ -1849,7 +2099,7 @@
 </file>
 
 <file path=word/footnotes.xml><?xml version="1.0" encoding="utf-8"?>
-<w:footnotes xmlns:wpc="http://schemas.microsoft.com/office/word/2010/wordprocessingCanvas" xmlns:cx="http://schemas.microsoft.com/office/drawing/2014/chartex" xmlns:cx1="http://schemas.microsoft.com/office/drawing/2015/9/8/chartex" xmlns:cx2="http://schemas.microsoft.com/office/drawing/2015/10/21/chartex" xmlns:cx3="http://schemas.microsoft.com/office/drawing/2016/5/9/chartex" xmlns:cx4="http://schemas.microsoft.com/office/drawing/2016/5/10/chartex" xmlns:cx5="http://schemas.microsoft.com/office/drawing/2016/5/11/chartex" xmlns:cx6="http://schemas.microsoft.com/office/drawing/2016/5/12/chartex" xmlns:cx7="http://schemas.microsoft.com/office/drawing/2016/5/13/chartex" xmlns:cx8="http://schemas.microsoft.com/office/drawing/2016/5/14/chartex" xmlns:mc="http://schemas.openxmlformats.org/markup-compatibility/2006" xmlns:aink="http://schemas.microsoft.com/office/drawing/2016/ink" xmlns:am3d="http://schemas.microsoft.com/office/drawing/2017/model3d" xmlns:o="urn:schemas-microsoft-com:office:office" xmlns:oel="http://schemas.microsoft.com/office/2019/extlst" xmlns:r="http://schemas.openxmlformats.org/officeDocument/2006/relationships" xmlns:m="http://schemas.openxmlformats.org/officeDocument/2006/math" xmlns:v="urn:schemas-microsoft-com:vml" xmlns:wp14="http://schemas.microsoft.com/office/word/2010/wordprocessingDrawing" xmlns:wp="http://schemas.openxmlformats.org/drawingml/2006/wordprocessingDrawing" xmlns:w10="urn:schemas-microsoft-com:office:word" xmlns:w="http://schemas.openxmlformats.org/wordprocessingml/2006/main" xmlns:w14="http://schemas.microsoft.com/office/word/2010/wordml" xmlns:w15="http://schemas.microsoft.com/office/word/2012/wordml" xmlns:w16cex="http://schemas.microsoft.com/office/word/2018/wordml/cex" xmlns:w16cid="http://schemas.microsoft.com/office/word/2016/wordml/cid" xmlns:w16="http://schemas.microsoft.com/office/word/2018/wordml" xmlns:w16du="http://schemas.microsoft.com/office/word/2023/wordml/word16du" xmlns:w16sdtdh="http://schemas.microsoft.com/office/word/2020/wordml/sdtdatahash" xmlns:w16sdtfl="http://schemas.microsoft.com/office/word/2024/wordml/sdtformatlock" xmlns:w16se="http://schemas.microsoft.com/office/word/2015/wordml/symex" xmlns:wpg="http://schemas.microsoft.com/office/word/2010/wordprocessingGroup" xmlns:wpi="http://schemas.microsoft.com/office/word/2010/wordprocessingInk" xmlns:wne="http://schemas.microsoft.com/office/word/2006/wordml" xmlns:wps="http://schemas.microsoft.com/office/word/2010/wordprocessingShape" mc:Ignorable="w14 w15 w16se w16cid w16 w16cex w16sdtdh w16sdtfl w16du wp14">
+<w:footnotes xmlns:wpc="http://schemas.microsoft.com/office/word/2010/wordprocessingCanvas" xmlns:cx="http://schemas.microsoft.com/office/drawing/2014/chartex" xmlns:cx1="http://schemas.microsoft.com/office/drawing/2015/9/8/chartex" xmlns:cx2="http://schemas.microsoft.com/office/drawing/2015/10/21/chartex" xmlns:cx3="http://schemas.microsoft.com/office/drawing/2016/5/9/chartex" xmlns:cx4="http://schemas.microsoft.com/office/drawing/2016/5/10/chartex" xmlns:cx5="http://schemas.microsoft.com/office/drawing/2016/5/11/chartex" xmlns:cx6="http://schemas.microsoft.com/office/drawing/2016/5/12/chartex" xmlns:cx7="http://schemas.microsoft.com/office/drawing/2016/5/13/chartex" xmlns:cx8="http://schemas.microsoft.com/office/drawing/2016/5/14/chartex" xmlns:mc="http://schemas.openxmlformats.org/markup-compatibility/2006" xmlns:aink="http://schemas.microsoft.com/office/drawing/2016/ink" xmlns:am3d="http://schemas.microsoft.com/office/drawing/2017/model3d" xmlns:o="urn:schemas-microsoft-com:office:office" xmlns:oel="http://schemas.microsoft.com/office/2019/extlst" xmlns:r="http://schemas.openxmlformats.org/officeDocument/2006/relationships" xmlns:m="http://schemas.openxmlformats.org/officeDocument/2006/math" xmlns:v="urn:schemas-microsoft-com:vml" xmlns:wp14="http://schemas.microsoft.com/office/word/2010/wordprocessingDrawing" xmlns:wp="http://schemas.openxmlformats.org/drawingml/2006/wordprocessingDrawing" xmlns:w10="urn:schemas-microsoft-com:office:word" xmlns:w="http://schemas.openxmlformats.org/wordprocessingml/2006/main" xmlns:w14="http://schemas.microsoft.com/office/word/2010/wordml" xmlns:w15="http://schemas.microsoft.com/office/word/2012/wordml" xmlns:w16cex="http://schemas.microsoft.com/office/word/2018/wordml/cex" xmlns:w16cid="http://schemas.microsoft.com/office/word/2016/wordml/cid" xmlns:w16="http://schemas.microsoft.com/office/word/2018/wordml" xmlns:w16du="http://schemas.microsoft.com/office/word/2023/wordml/word16du" xmlns:w16sdtdh="http://schemas.microsoft.com/office/word/2020/wordml/sdtdatahash" xmlns:w16se="http://schemas.microsoft.com/office/word/2015/wordml/symex" xmlns:wpg="http://schemas.microsoft.com/office/word/2010/wordprocessingGroup" xmlns:wpi="http://schemas.microsoft.com/office/word/2010/wordprocessingInk" xmlns:wne="http://schemas.microsoft.com/office/word/2006/wordml" xmlns:wps="http://schemas.microsoft.com/office/word/2010/wordprocessingShape" mc:Ignorable="w14 w15 w16se w16cid w16 w16cex w16sdtdh w16du wp14">
   <w:footnote w:type="separator" w:id="-1">
     <w:p>
       <w:pPr>
@@ -1874,10 +2124,10 @@
 </file>
 
 <file path=word/header1.xml><?xml version="1.0" encoding="utf-8"?>
-<w:hdr xmlns:wpc="http://schemas.microsoft.com/office/word/2010/wordprocessingCanvas" xmlns:cx="http://schemas.microsoft.com/office/drawing/2014/chartex" xmlns:cx1="http://schemas.microsoft.com/office/drawing/2015/9/8/chartex" xmlns:cx2="http://schemas.microsoft.com/office/drawing/2015/10/21/chartex" xmlns:cx3="http://schemas.microsoft.com/office/drawing/2016/5/9/chartex" xmlns:cx4="http://schemas.microsoft.com/office/drawing/2016/5/10/chartex" xmlns:cx5="http://schemas.microsoft.com/office/drawing/2016/5/11/chartex" xmlns:cx6="http://schemas.microsoft.com/office/drawing/2016/5/12/chartex" xmlns:cx7="http://schemas.microsoft.com/office/drawing/2016/5/13/chartex" xmlns:cx8="http://schemas.microsoft.com/office/drawing/2016/5/14/chartex" xmlns:mc="http://schemas.openxmlformats.org/markup-compatibility/2006" xmlns:aink="http://schemas.microsoft.com/office/drawing/2016/ink" xmlns:am3d="http://schemas.microsoft.com/office/drawing/2017/model3d" xmlns:o="urn:schemas-microsoft-com:office:office" xmlns:oel="http://schemas.microsoft.com/office/2019/extlst" xmlns:r="http://schemas.openxmlformats.org/officeDocument/2006/relationships" xmlns:m="http://schemas.openxmlformats.org/officeDocument/2006/math" xmlns:v="urn:schemas-microsoft-com:vml" xmlns:wp14="http://schemas.microsoft.com/office/word/2010/wordprocessingDrawing" xmlns:wp="http://schemas.openxmlformats.org/drawingml/2006/wordprocessingDrawing" xmlns:w10="urn:schemas-microsoft-com:office:word" xmlns:w="http://schemas.openxmlformats.org/wordprocessingml/2006/main" xmlns:w14="http://schemas.microsoft.com/office/word/2010/wordml" xmlns:w15="http://schemas.microsoft.com/office/word/2012/wordml" xmlns:w16cex="http://schemas.microsoft.com/office/word/2018/wordml/cex" xmlns:w16cid="http://schemas.microsoft.com/office/word/2016/wordml/cid" xmlns:w16="http://schemas.microsoft.com/office/word/2018/wordml" xmlns:w16du="http://schemas.microsoft.com/office/word/2023/wordml/word16du" xmlns:w16sdtdh="http://schemas.microsoft.com/office/word/2020/wordml/sdtdatahash" xmlns:w16sdtfl="http://schemas.microsoft.com/office/word/2024/wordml/sdtformatlock" xmlns:w16se="http://schemas.microsoft.com/office/word/2015/wordml/symex" xmlns:wpg="http://schemas.microsoft.com/office/word/2010/wordprocessingGroup" xmlns:wpi="http://schemas.microsoft.com/office/word/2010/wordprocessingInk" xmlns:wne="http://schemas.microsoft.com/office/word/2006/wordml" xmlns:wps="http://schemas.microsoft.com/office/word/2010/wordprocessingShape" mc:Ignorable="w14 w15 w16se w16cid w16 w16cex w16sdtdh w16sdtfl w16du wp14">
+<w:hdr xmlns:wpc="http://schemas.microsoft.com/office/word/2010/wordprocessingCanvas" xmlns:cx="http://schemas.microsoft.com/office/drawing/2014/chartex" xmlns:cx1="http://schemas.microsoft.com/office/drawing/2015/9/8/chartex" xmlns:cx2="http://schemas.microsoft.com/office/drawing/2015/10/21/chartex" xmlns:cx3="http://schemas.microsoft.com/office/drawing/2016/5/9/chartex" xmlns:cx4="http://schemas.microsoft.com/office/drawing/2016/5/10/chartex" xmlns:cx5="http://schemas.microsoft.com/office/drawing/2016/5/11/chartex" xmlns:cx6="http://schemas.microsoft.com/office/drawing/2016/5/12/chartex" xmlns:cx7="http://schemas.microsoft.com/office/drawing/2016/5/13/chartex" xmlns:cx8="http://schemas.microsoft.com/office/drawing/2016/5/14/chartex" xmlns:mc="http://schemas.openxmlformats.org/markup-compatibility/2006" xmlns:aink="http://schemas.microsoft.com/office/drawing/2016/ink" xmlns:am3d="http://schemas.microsoft.com/office/drawing/2017/model3d" xmlns:o="urn:schemas-microsoft-com:office:office" xmlns:oel="http://schemas.microsoft.com/office/2019/extlst" xmlns:r="http://schemas.openxmlformats.org/officeDocument/2006/relationships" xmlns:m="http://schemas.openxmlformats.org/officeDocument/2006/math" xmlns:v="urn:schemas-microsoft-com:vml" xmlns:wp14="http://schemas.microsoft.com/office/word/2010/wordprocessingDrawing" xmlns:wp="http://schemas.openxmlformats.org/drawingml/2006/wordprocessingDrawing" xmlns:w10="urn:schemas-microsoft-com:office:word" xmlns:w="http://schemas.openxmlformats.org/wordprocessingml/2006/main" xmlns:w14="http://schemas.microsoft.com/office/word/2010/wordml" xmlns:w15="http://schemas.microsoft.com/office/word/2012/wordml" xmlns:w16cex="http://schemas.microsoft.com/office/word/2018/wordml/cex" xmlns:w16cid="http://schemas.microsoft.com/office/word/2016/wordml/cid" xmlns:w16="http://schemas.microsoft.com/office/word/2018/wordml" xmlns:w16du="http://schemas.microsoft.com/office/word/2023/wordml/word16du" xmlns:w16sdtdh="http://schemas.microsoft.com/office/word/2020/wordml/sdtdatahash" xmlns:w16se="http://schemas.microsoft.com/office/word/2015/wordml/symex" xmlns:wpg="http://schemas.microsoft.com/office/word/2010/wordprocessingGroup" xmlns:wpi="http://schemas.microsoft.com/office/word/2010/wordprocessingInk" xmlns:wne="http://schemas.microsoft.com/office/word/2006/wordml" xmlns:wps="http://schemas.microsoft.com/office/word/2010/wordprocessingShape" mc:Ignorable="w14 w15 w16se w16cid w16 w16cex w16sdtdh w16du wp14">
   <w:p>
     <w:pPr>
-      <w:pStyle w:val="Encabezado"/>
+      <w:pStyle w:val="Header"/>
     </w:pPr>
     <w:r>
       <w:rPr>
@@ -1927,7 +2177,7 @@
 </file>
 
 <file path=word/numbering.xml><?xml version="1.0" encoding="utf-8"?>
-<w:numbering xmlns:wpc="http://schemas.microsoft.com/office/word/2010/wordprocessingCanvas" xmlns:cx="http://schemas.microsoft.com/office/drawing/2014/chartex" xmlns:cx1="http://schemas.microsoft.com/office/drawing/2015/9/8/chartex" xmlns:cx2="http://schemas.microsoft.com/office/drawing/2015/10/21/chartex" xmlns:cx3="http://schemas.microsoft.com/office/drawing/2016/5/9/chartex" xmlns:cx4="http://schemas.microsoft.com/office/drawing/2016/5/10/chartex" xmlns:cx5="http://schemas.microsoft.com/office/drawing/2016/5/11/chartex" xmlns:cx6="http://schemas.microsoft.com/office/drawing/2016/5/12/chartex" xmlns:cx7="http://schemas.microsoft.com/office/drawing/2016/5/13/chartex" xmlns:cx8="http://schemas.microsoft.com/office/drawing/2016/5/14/chartex" xmlns:mc="http://schemas.openxmlformats.org/markup-compatibility/2006" xmlns:aink="http://schemas.microsoft.com/office/drawing/2016/ink" xmlns:am3d="http://schemas.microsoft.com/office/drawing/2017/model3d" xmlns:o="urn:schemas-microsoft-com:office:office" xmlns:oel="http://schemas.microsoft.com/office/2019/extlst" xmlns:r="http://schemas.openxmlformats.org/officeDocument/2006/relationships" xmlns:m="http://schemas.openxmlformats.org/officeDocument/2006/math" xmlns:v="urn:schemas-microsoft-com:vml" xmlns:wp14="http://schemas.microsoft.com/office/word/2010/wordprocessingDrawing" xmlns:wp="http://schemas.openxmlformats.org/drawingml/2006/wordprocessingDrawing" xmlns:w10="urn:schemas-microsoft-com:office:word" xmlns:w="http://schemas.openxmlformats.org/wordprocessingml/2006/main" xmlns:w14="http://schemas.microsoft.com/office/word/2010/wordml" xmlns:w15="http://schemas.microsoft.com/office/word/2012/wordml" xmlns:w16cex="http://schemas.microsoft.com/office/word/2018/wordml/cex" xmlns:w16cid="http://schemas.microsoft.com/office/word/2016/wordml/cid" xmlns:w16="http://schemas.microsoft.com/office/word/2018/wordml" xmlns:w16du="http://schemas.microsoft.com/office/word/2023/wordml/word16du" xmlns:w16sdtdh="http://schemas.microsoft.com/office/word/2020/wordml/sdtdatahash" xmlns:w16sdtfl="http://schemas.microsoft.com/office/word/2024/wordml/sdtformatlock" xmlns:w16se="http://schemas.microsoft.com/office/word/2015/wordml/symex" xmlns:wpg="http://schemas.microsoft.com/office/word/2010/wordprocessingGroup" xmlns:wpi="http://schemas.microsoft.com/office/word/2010/wordprocessingInk" xmlns:wne="http://schemas.microsoft.com/office/word/2006/wordml" xmlns:wps="http://schemas.microsoft.com/office/word/2010/wordprocessingShape" mc:Ignorable="w14 w15 w16se w16cid w16 w16cex w16sdtdh w16sdtfl w16du wp14">
+<w:numbering xmlns:wpc="http://schemas.microsoft.com/office/word/2010/wordprocessingCanvas" xmlns:cx="http://schemas.microsoft.com/office/drawing/2014/chartex" xmlns:cx1="http://schemas.microsoft.com/office/drawing/2015/9/8/chartex" xmlns:cx2="http://schemas.microsoft.com/office/drawing/2015/10/21/chartex" xmlns:cx3="http://schemas.microsoft.com/office/drawing/2016/5/9/chartex" xmlns:cx4="http://schemas.microsoft.com/office/drawing/2016/5/10/chartex" xmlns:cx5="http://schemas.microsoft.com/office/drawing/2016/5/11/chartex" xmlns:cx6="http://schemas.microsoft.com/office/drawing/2016/5/12/chartex" xmlns:cx7="http://schemas.microsoft.com/office/drawing/2016/5/13/chartex" xmlns:cx8="http://schemas.microsoft.com/office/drawing/2016/5/14/chartex" xmlns:mc="http://schemas.openxmlformats.org/markup-compatibility/2006" xmlns:aink="http://schemas.microsoft.com/office/drawing/2016/ink" xmlns:am3d="http://schemas.microsoft.com/office/drawing/2017/model3d" xmlns:o="urn:schemas-microsoft-com:office:office" xmlns:oel="http://schemas.microsoft.com/office/2019/extlst" xmlns:r="http://schemas.openxmlformats.org/officeDocument/2006/relationships" xmlns:m="http://schemas.openxmlformats.org/officeDocument/2006/math" xmlns:v="urn:schemas-microsoft-com:vml" xmlns:wp14="http://schemas.microsoft.com/office/word/2010/wordprocessingDrawing" xmlns:wp="http://schemas.openxmlformats.org/drawingml/2006/wordprocessingDrawing" xmlns:w10="urn:schemas-microsoft-com:office:word" xmlns:w="http://schemas.openxmlformats.org/wordprocessingml/2006/main" xmlns:w14="http://schemas.microsoft.com/office/word/2010/wordml" xmlns:w15="http://schemas.microsoft.com/office/word/2012/wordml" xmlns:w16cex="http://schemas.microsoft.com/office/word/2018/wordml/cex" xmlns:w16cid="http://schemas.microsoft.com/office/word/2016/wordml/cid" xmlns:w16="http://schemas.microsoft.com/office/word/2018/wordml" xmlns:w16du="http://schemas.microsoft.com/office/word/2023/wordml/word16du" xmlns:w16sdtdh="http://schemas.microsoft.com/office/word/2020/wordml/sdtdatahash" xmlns:w16se="http://schemas.microsoft.com/office/word/2015/wordml/symex" xmlns:wpg="http://schemas.microsoft.com/office/word/2010/wordprocessingGroup" xmlns:wpi="http://schemas.microsoft.com/office/word/2010/wordprocessingInk" xmlns:wne="http://schemas.microsoft.com/office/word/2006/wordml" xmlns:wps="http://schemas.microsoft.com/office/word/2010/wordprocessingShape" mc:Ignorable="w14 w15 w16se w16cid w16 w16cex w16sdtdh w16du wp14">
   <w:abstractNum w:abstractNumId="0" w15:restartNumberingAfterBreak="0">
     <w:nsid w:val="01582BC1"/>
     <w:multiLevelType w:val="multilevel"/>
@@ -3996,7 +4246,7 @@
 </file>
 
 <file path=word/styles.xml><?xml version="1.0" encoding="utf-8"?>
-<w:styles xmlns:mc="http://schemas.openxmlformats.org/markup-compatibility/2006" xmlns:r="http://schemas.openxmlformats.org/officeDocument/2006/relationships" xmlns:w="http://schemas.openxmlformats.org/wordprocessingml/2006/main" xmlns:w14="http://schemas.microsoft.com/office/word/2010/wordml" xmlns:w15="http://schemas.microsoft.com/office/word/2012/wordml" xmlns:w16cex="http://schemas.microsoft.com/office/word/2018/wordml/cex" xmlns:w16cid="http://schemas.microsoft.com/office/word/2016/wordml/cid" xmlns:w16="http://schemas.microsoft.com/office/word/2018/wordml" xmlns:w16du="http://schemas.microsoft.com/office/word/2023/wordml/word16du" xmlns:w16sdtdh="http://schemas.microsoft.com/office/word/2020/wordml/sdtdatahash" xmlns:w16sdtfl="http://schemas.microsoft.com/office/word/2024/wordml/sdtformatlock" xmlns:w16se="http://schemas.microsoft.com/office/word/2015/wordml/symex" mc:Ignorable="w14 w15 w16se w16cid w16 w16cex w16sdtdh w16sdtfl w16du">
+<w:styles xmlns:mc="http://schemas.openxmlformats.org/markup-compatibility/2006" xmlns:r="http://schemas.openxmlformats.org/officeDocument/2006/relationships" xmlns:w="http://schemas.openxmlformats.org/wordprocessingml/2006/main" xmlns:w14="http://schemas.microsoft.com/office/word/2010/wordml" xmlns:w15="http://schemas.microsoft.com/office/word/2012/wordml" xmlns:w16cex="http://schemas.microsoft.com/office/word/2018/wordml/cex" xmlns:w16cid="http://schemas.microsoft.com/office/word/2016/wordml/cid" xmlns:w16="http://schemas.microsoft.com/office/word/2018/wordml" xmlns:w16du="http://schemas.microsoft.com/office/word/2023/wordml/word16du" xmlns:w16sdtdh="http://schemas.microsoft.com/office/word/2020/wordml/sdtdatahash" xmlns:w16se="http://schemas.microsoft.com/office/word/2015/wordml/symex" mc:Ignorable="w14 w15 w16se w16cid w16 w16cex w16sdtdh w16du">
   <w:docDefaults>
     <w:rPrDefault>
       <w:rPr>
@@ -4396,11 +4646,11 @@
     <w:name w:val="Normal"/>
     <w:qFormat/>
   </w:style>
-  <w:style w:type="paragraph" w:styleId="Ttulo1">
+  <w:style w:type="paragraph" w:styleId="Heading1">
     <w:name w:val="heading 1"/>
     <w:basedOn w:val="Normal"/>
     <w:next w:val="Normal"/>
-    <w:link w:val="Ttulo1Car"/>
+    <w:link w:val="Heading1Char"/>
     <w:uiPriority w:val="9"/>
     <w:qFormat/>
     <w:rsid w:val="004A0631"/>
@@ -4417,11 +4667,11 @@
       <w:szCs w:val="40"/>
     </w:rPr>
   </w:style>
-  <w:style w:type="paragraph" w:styleId="Ttulo2">
+  <w:style w:type="paragraph" w:styleId="Heading2">
     <w:name w:val="heading 2"/>
     <w:basedOn w:val="Normal"/>
     <w:next w:val="Normal"/>
-    <w:link w:val="Ttulo2Car"/>
+    <w:link w:val="Heading2Char"/>
     <w:uiPriority w:val="9"/>
     <w:semiHidden/>
     <w:unhideWhenUsed/>
@@ -4440,11 +4690,11 @@
       <w:szCs w:val="32"/>
     </w:rPr>
   </w:style>
-  <w:style w:type="paragraph" w:styleId="Ttulo3">
+  <w:style w:type="paragraph" w:styleId="Heading3">
     <w:name w:val="heading 3"/>
     <w:basedOn w:val="Normal"/>
     <w:next w:val="Normal"/>
-    <w:link w:val="Ttulo3Car"/>
+    <w:link w:val="Heading3Char"/>
     <w:uiPriority w:val="9"/>
     <w:unhideWhenUsed/>
     <w:qFormat/>
@@ -4462,11 +4712,11 @@
       <w:szCs w:val="28"/>
     </w:rPr>
   </w:style>
-  <w:style w:type="paragraph" w:styleId="Ttulo4">
+  <w:style w:type="paragraph" w:styleId="Heading4">
     <w:name w:val="heading 4"/>
     <w:basedOn w:val="Normal"/>
     <w:next w:val="Normal"/>
-    <w:link w:val="Ttulo4Car"/>
+    <w:link w:val="Heading4Char"/>
     <w:uiPriority w:val="9"/>
     <w:semiHidden/>
     <w:unhideWhenUsed/>
@@ -4485,11 +4735,11 @@
       <w:color w:val="0F4761" w:themeColor="accent1" w:themeShade="BF"/>
     </w:rPr>
   </w:style>
-  <w:style w:type="paragraph" w:styleId="Ttulo5">
+  <w:style w:type="paragraph" w:styleId="Heading5">
     <w:name w:val="heading 5"/>
     <w:basedOn w:val="Normal"/>
     <w:next w:val="Normal"/>
-    <w:link w:val="Ttulo5Car"/>
+    <w:link w:val="Heading5Char"/>
     <w:uiPriority w:val="9"/>
     <w:semiHidden/>
     <w:unhideWhenUsed/>
@@ -4506,11 +4756,11 @@
       <w:color w:val="0F4761" w:themeColor="accent1" w:themeShade="BF"/>
     </w:rPr>
   </w:style>
-  <w:style w:type="paragraph" w:styleId="Ttulo6">
+  <w:style w:type="paragraph" w:styleId="Heading6">
     <w:name w:val="heading 6"/>
     <w:basedOn w:val="Normal"/>
     <w:next w:val="Normal"/>
-    <w:link w:val="Ttulo6Car"/>
+    <w:link w:val="Heading6Char"/>
     <w:uiPriority w:val="9"/>
     <w:semiHidden/>
     <w:unhideWhenUsed/>
@@ -4529,11 +4779,11 @@
       <w:color w:val="595959" w:themeColor="text1" w:themeTint="A6"/>
     </w:rPr>
   </w:style>
-  <w:style w:type="paragraph" w:styleId="Ttulo7">
+  <w:style w:type="paragraph" w:styleId="Heading7">
     <w:name w:val="heading 7"/>
     <w:basedOn w:val="Normal"/>
     <w:next w:val="Normal"/>
-    <w:link w:val="Ttulo7Car"/>
+    <w:link w:val="Heading7Char"/>
     <w:uiPriority w:val="9"/>
     <w:semiHidden/>
     <w:unhideWhenUsed/>
@@ -4550,11 +4800,11 @@
       <w:color w:val="595959" w:themeColor="text1" w:themeTint="A6"/>
     </w:rPr>
   </w:style>
-  <w:style w:type="paragraph" w:styleId="Ttulo8">
+  <w:style w:type="paragraph" w:styleId="Heading8">
     <w:name w:val="heading 8"/>
     <w:basedOn w:val="Normal"/>
     <w:next w:val="Normal"/>
-    <w:link w:val="Ttulo8Car"/>
+    <w:link w:val="Heading8Char"/>
     <w:uiPriority w:val="9"/>
     <w:semiHidden/>
     <w:unhideWhenUsed/>
@@ -4573,11 +4823,11 @@
       <w:color w:val="272727" w:themeColor="text1" w:themeTint="D8"/>
     </w:rPr>
   </w:style>
-  <w:style w:type="paragraph" w:styleId="Ttulo9">
+  <w:style w:type="paragraph" w:styleId="Heading9">
     <w:name w:val="heading 9"/>
     <w:basedOn w:val="Normal"/>
     <w:next w:val="Normal"/>
-    <w:link w:val="Ttulo9Car"/>
+    <w:link w:val="Heading9Char"/>
     <w:uiPriority w:val="9"/>
     <w:semiHidden/>
     <w:unhideWhenUsed/>
@@ -4594,12 +4844,13 @@
       <w:color w:val="272727" w:themeColor="text1" w:themeTint="D8"/>
     </w:rPr>
   </w:style>
-  <w:style w:type="character" w:default="1" w:styleId="Fuentedeprrafopredeter">
+  <w:style w:type="character" w:default="1" w:styleId="DefaultParagraphFont">
     <w:name w:val="Default Paragraph Font"/>
     <w:uiPriority w:val="1"/>
+    <w:semiHidden/>
     <w:unhideWhenUsed/>
   </w:style>
-  <w:style w:type="table" w:default="1" w:styleId="Tablanormal">
+  <w:style w:type="table" w:default="1" w:styleId="TableNormal">
     <w:name w:val="Normal Table"/>
     <w:uiPriority w:val="99"/>
     <w:semiHidden/>
@@ -4614,16 +4865,16 @@
       </w:tblCellMar>
     </w:tblPr>
   </w:style>
-  <w:style w:type="numbering" w:default="1" w:styleId="Sinlista">
+  <w:style w:type="numbering" w:default="1" w:styleId="NoList">
     <w:name w:val="No List"/>
     <w:uiPriority w:val="99"/>
     <w:semiHidden/>
     <w:unhideWhenUsed/>
   </w:style>
-  <w:style w:type="character" w:customStyle="1" w:styleId="Ttulo1Car">
-    <w:name w:val="Título 1 Car"/>
-    <w:basedOn w:val="Fuentedeprrafopredeter"/>
-    <w:link w:val="Ttulo1"/>
+  <w:style w:type="character" w:customStyle="1" w:styleId="Heading1Char">
+    <w:name w:val="Heading 1 Char"/>
+    <w:basedOn w:val="DefaultParagraphFont"/>
+    <w:link w:val="Heading1"/>
     <w:uiPriority w:val="9"/>
     <w:rsid w:val="004A0631"/>
     <w:rPr>
@@ -4633,10 +4884,10 @@
       <w:szCs w:val="40"/>
     </w:rPr>
   </w:style>
-  <w:style w:type="character" w:customStyle="1" w:styleId="Ttulo2Car">
-    <w:name w:val="Título 2 Car"/>
-    <w:basedOn w:val="Fuentedeprrafopredeter"/>
-    <w:link w:val="Ttulo2"/>
+  <w:style w:type="character" w:customStyle="1" w:styleId="Heading2Char">
+    <w:name w:val="Heading 2 Char"/>
+    <w:basedOn w:val="DefaultParagraphFont"/>
+    <w:link w:val="Heading2"/>
     <w:uiPriority w:val="9"/>
     <w:semiHidden/>
     <w:rsid w:val="004A0631"/>
@@ -4647,10 +4898,10 @@
       <w:szCs w:val="32"/>
     </w:rPr>
   </w:style>
-  <w:style w:type="character" w:customStyle="1" w:styleId="Ttulo3Car">
-    <w:name w:val="Título 3 Car"/>
-    <w:basedOn w:val="Fuentedeprrafopredeter"/>
-    <w:link w:val="Ttulo3"/>
+  <w:style w:type="character" w:customStyle="1" w:styleId="Heading3Char">
+    <w:name w:val="Heading 3 Char"/>
+    <w:basedOn w:val="DefaultParagraphFont"/>
+    <w:link w:val="Heading3"/>
     <w:uiPriority w:val="9"/>
     <w:rsid w:val="004A0631"/>
     <w:rPr>
@@ -4660,10 +4911,10 @@
       <w:szCs w:val="28"/>
     </w:rPr>
   </w:style>
-  <w:style w:type="character" w:customStyle="1" w:styleId="Ttulo4Car">
-    <w:name w:val="Título 4 Car"/>
-    <w:basedOn w:val="Fuentedeprrafopredeter"/>
-    <w:link w:val="Ttulo4"/>
+  <w:style w:type="character" w:customStyle="1" w:styleId="Heading4Char">
+    <w:name w:val="Heading 4 Char"/>
+    <w:basedOn w:val="DefaultParagraphFont"/>
+    <w:link w:val="Heading4"/>
     <w:uiPriority w:val="9"/>
     <w:semiHidden/>
     <w:rsid w:val="004A0631"/>
@@ -4674,10 +4925,10 @@
       <w:color w:val="0F4761" w:themeColor="accent1" w:themeShade="BF"/>
     </w:rPr>
   </w:style>
-  <w:style w:type="character" w:customStyle="1" w:styleId="Ttulo5Car">
-    <w:name w:val="Título 5 Car"/>
-    <w:basedOn w:val="Fuentedeprrafopredeter"/>
-    <w:link w:val="Ttulo5"/>
+  <w:style w:type="character" w:customStyle="1" w:styleId="Heading5Char">
+    <w:name w:val="Heading 5 Char"/>
+    <w:basedOn w:val="DefaultParagraphFont"/>
+    <w:link w:val="Heading5"/>
     <w:uiPriority w:val="9"/>
     <w:semiHidden/>
     <w:rsid w:val="004A0631"/>
@@ -4686,10 +4937,10 @@
       <w:color w:val="0F4761" w:themeColor="accent1" w:themeShade="BF"/>
     </w:rPr>
   </w:style>
-  <w:style w:type="character" w:customStyle="1" w:styleId="Ttulo6Car">
-    <w:name w:val="Título 6 Car"/>
-    <w:basedOn w:val="Fuentedeprrafopredeter"/>
-    <w:link w:val="Ttulo6"/>
+  <w:style w:type="character" w:customStyle="1" w:styleId="Heading6Char">
+    <w:name w:val="Heading 6 Char"/>
+    <w:basedOn w:val="DefaultParagraphFont"/>
+    <w:link w:val="Heading6"/>
     <w:uiPriority w:val="9"/>
     <w:semiHidden/>
     <w:rsid w:val="004A0631"/>
@@ -4700,10 +4951,10 @@
       <w:color w:val="595959" w:themeColor="text1" w:themeTint="A6"/>
     </w:rPr>
   </w:style>
-  <w:style w:type="character" w:customStyle="1" w:styleId="Ttulo7Car">
-    <w:name w:val="Título 7 Car"/>
-    <w:basedOn w:val="Fuentedeprrafopredeter"/>
-    <w:link w:val="Ttulo7"/>
+  <w:style w:type="character" w:customStyle="1" w:styleId="Heading7Char">
+    <w:name w:val="Heading 7 Char"/>
+    <w:basedOn w:val="DefaultParagraphFont"/>
+    <w:link w:val="Heading7"/>
     <w:uiPriority w:val="9"/>
     <w:semiHidden/>
     <w:rsid w:val="004A0631"/>
@@ -4712,10 +4963,10 @@
       <w:color w:val="595959" w:themeColor="text1" w:themeTint="A6"/>
     </w:rPr>
   </w:style>
-  <w:style w:type="character" w:customStyle="1" w:styleId="Ttulo8Car">
-    <w:name w:val="Título 8 Car"/>
-    <w:basedOn w:val="Fuentedeprrafopredeter"/>
-    <w:link w:val="Ttulo8"/>
+  <w:style w:type="character" w:customStyle="1" w:styleId="Heading8Char">
+    <w:name w:val="Heading 8 Char"/>
+    <w:basedOn w:val="DefaultParagraphFont"/>
+    <w:link w:val="Heading8"/>
     <w:uiPriority w:val="9"/>
     <w:semiHidden/>
     <w:rsid w:val="004A0631"/>
@@ -4726,10 +4977,10 @@
       <w:color w:val="272727" w:themeColor="text1" w:themeTint="D8"/>
     </w:rPr>
   </w:style>
-  <w:style w:type="character" w:customStyle="1" w:styleId="Ttulo9Car">
-    <w:name w:val="Título 9 Car"/>
-    <w:basedOn w:val="Fuentedeprrafopredeter"/>
-    <w:link w:val="Ttulo9"/>
+  <w:style w:type="character" w:customStyle="1" w:styleId="Heading9Char">
+    <w:name w:val="Heading 9 Char"/>
+    <w:basedOn w:val="DefaultParagraphFont"/>
+    <w:link w:val="Heading9"/>
     <w:uiPriority w:val="9"/>
     <w:semiHidden/>
     <w:rsid w:val="004A0631"/>
@@ -4738,11 +4989,11 @@
       <w:color w:val="272727" w:themeColor="text1" w:themeTint="D8"/>
     </w:rPr>
   </w:style>
-  <w:style w:type="paragraph" w:styleId="Ttulo">
+  <w:style w:type="paragraph" w:styleId="Title">
     <w:name w:val="Title"/>
     <w:basedOn w:val="Normal"/>
     <w:next w:val="Normal"/>
-    <w:link w:val="TtuloCar"/>
+    <w:link w:val="TitleChar"/>
     <w:uiPriority w:val="10"/>
     <w:qFormat/>
     <w:rsid w:val="004A0631"/>
@@ -4758,10 +5009,10 @@
       <w:szCs w:val="56"/>
     </w:rPr>
   </w:style>
-  <w:style w:type="character" w:customStyle="1" w:styleId="TtuloCar">
-    <w:name w:val="Título Car"/>
-    <w:basedOn w:val="Fuentedeprrafopredeter"/>
-    <w:link w:val="Ttulo"/>
+  <w:style w:type="character" w:customStyle="1" w:styleId="TitleChar">
+    <w:name w:val="Title Char"/>
+    <w:basedOn w:val="DefaultParagraphFont"/>
+    <w:link w:val="Title"/>
     <w:uiPriority w:val="10"/>
     <w:rsid w:val="004A0631"/>
     <w:rPr>
@@ -4772,11 +5023,11 @@
       <w:szCs w:val="56"/>
     </w:rPr>
   </w:style>
-  <w:style w:type="paragraph" w:styleId="Subttulo">
+  <w:style w:type="paragraph" w:styleId="Subtitle">
     <w:name w:val="Subtitle"/>
     <w:basedOn w:val="Normal"/>
     <w:next w:val="Normal"/>
-    <w:link w:val="SubttuloCar"/>
+    <w:link w:val="SubtitleChar"/>
     <w:uiPriority w:val="11"/>
     <w:qFormat/>
     <w:rsid w:val="004A0631"/>
@@ -4793,10 +5044,10 @@
       <w:szCs w:val="28"/>
     </w:rPr>
   </w:style>
-  <w:style w:type="character" w:customStyle="1" w:styleId="SubttuloCar">
-    <w:name w:val="Subtítulo Car"/>
-    <w:basedOn w:val="Fuentedeprrafopredeter"/>
-    <w:link w:val="Subttulo"/>
+  <w:style w:type="character" w:customStyle="1" w:styleId="SubtitleChar">
+    <w:name w:val="Subtitle Char"/>
+    <w:basedOn w:val="DefaultParagraphFont"/>
+    <w:link w:val="Subtitle"/>
     <w:uiPriority w:val="11"/>
     <w:rsid w:val="004A0631"/>
     <w:rPr>
@@ -4807,11 +5058,11 @@
       <w:szCs w:val="28"/>
     </w:rPr>
   </w:style>
-  <w:style w:type="paragraph" w:styleId="Cita">
+  <w:style w:type="paragraph" w:styleId="Quote">
     <w:name w:val="Quote"/>
     <w:basedOn w:val="Normal"/>
     <w:next w:val="Normal"/>
-    <w:link w:val="CitaCar"/>
+    <w:link w:val="QuoteChar"/>
     <w:uiPriority w:val="29"/>
     <w:qFormat/>
     <w:rsid w:val="004A0631"/>
@@ -4825,10 +5076,10 @@
       <w:color w:val="404040" w:themeColor="text1" w:themeTint="BF"/>
     </w:rPr>
   </w:style>
-  <w:style w:type="character" w:customStyle="1" w:styleId="CitaCar">
-    <w:name w:val="Cita Car"/>
-    <w:basedOn w:val="Fuentedeprrafopredeter"/>
-    <w:link w:val="Cita"/>
+  <w:style w:type="character" w:customStyle="1" w:styleId="QuoteChar">
+    <w:name w:val="Quote Char"/>
+    <w:basedOn w:val="DefaultParagraphFont"/>
+    <w:link w:val="Quote"/>
     <w:uiPriority w:val="29"/>
     <w:rsid w:val="004A0631"/>
     <w:rPr>
@@ -4837,7 +5088,7 @@
       <w:color w:val="404040" w:themeColor="text1" w:themeTint="BF"/>
     </w:rPr>
   </w:style>
-  <w:style w:type="paragraph" w:styleId="Prrafodelista">
+  <w:style w:type="paragraph" w:styleId="ListParagraph">
     <w:name w:val="List Paragraph"/>
     <w:basedOn w:val="Normal"/>
     <w:uiPriority w:val="34"/>
@@ -4848,9 +5099,9 @@
       <w:contextualSpacing/>
     </w:pPr>
   </w:style>
-  <w:style w:type="character" w:styleId="nfasisintenso">
+  <w:style w:type="character" w:styleId="IntenseEmphasis">
     <w:name w:val="Intense Emphasis"/>
-    <w:basedOn w:val="Fuentedeprrafopredeter"/>
+    <w:basedOn w:val="DefaultParagraphFont"/>
     <w:uiPriority w:val="21"/>
     <w:qFormat/>
     <w:rsid w:val="004A0631"/>
@@ -4860,11 +5111,11 @@
       <w:color w:val="0F4761" w:themeColor="accent1" w:themeShade="BF"/>
     </w:rPr>
   </w:style>
-  <w:style w:type="paragraph" w:styleId="Citadestacada">
+  <w:style w:type="paragraph" w:styleId="IntenseQuote">
     <w:name w:val="Intense Quote"/>
     <w:basedOn w:val="Normal"/>
     <w:next w:val="Normal"/>
-    <w:link w:val="CitadestacadaCar"/>
+    <w:link w:val="IntenseQuoteChar"/>
     <w:uiPriority w:val="30"/>
     <w:qFormat/>
     <w:rsid w:val="004A0631"/>
@@ -4883,10 +5134,10 @@
       <w:color w:val="0F4761" w:themeColor="accent1" w:themeShade="BF"/>
     </w:rPr>
   </w:style>
-  <w:style w:type="character" w:customStyle="1" w:styleId="CitadestacadaCar">
-    <w:name w:val="Cita destacada Car"/>
-    <w:basedOn w:val="Fuentedeprrafopredeter"/>
-    <w:link w:val="Citadestacada"/>
+  <w:style w:type="character" w:customStyle="1" w:styleId="IntenseQuoteChar">
+    <w:name w:val="Intense Quote Char"/>
+    <w:basedOn w:val="DefaultParagraphFont"/>
+    <w:link w:val="IntenseQuote"/>
     <w:uiPriority w:val="30"/>
     <w:rsid w:val="004A0631"/>
     <w:rPr>
@@ -4895,9 +5146,9 @@
       <w:color w:val="0F4761" w:themeColor="accent1" w:themeShade="BF"/>
     </w:rPr>
   </w:style>
-  <w:style w:type="character" w:styleId="Referenciaintensa">
+  <w:style w:type="character" w:styleId="IntenseReference">
     <w:name w:val="Intense Reference"/>
-    <w:basedOn w:val="Fuentedeprrafopredeter"/>
+    <w:basedOn w:val="DefaultParagraphFont"/>
     <w:uiPriority w:val="32"/>
     <w:qFormat/>
     <w:rsid w:val="004A0631"/>
@@ -4909,9 +5160,9 @@
       <w:spacing w:val="5"/>
     </w:rPr>
   </w:style>
-  <w:style w:type="character" w:styleId="Hipervnculo">
+  <w:style w:type="character" w:styleId="Hyperlink">
     <w:name w:val="Hyperlink"/>
-    <w:basedOn w:val="Fuentedeprrafopredeter"/>
+    <w:basedOn w:val="DefaultParagraphFont"/>
     <w:uiPriority w:val="99"/>
     <w:unhideWhenUsed/>
     <w:rsid w:val="004A0631"/>
@@ -4920,9 +5171,9 @@
       <w:u w:val="single"/>
     </w:rPr>
   </w:style>
-  <w:style w:type="character" w:styleId="Mencinsinresolver">
+  <w:style w:type="character" w:styleId="UnresolvedMention">
     <w:name w:val="Unresolved Mention"/>
-    <w:basedOn w:val="Fuentedeprrafopredeter"/>
+    <w:basedOn w:val="DefaultParagraphFont"/>
     <w:uiPriority w:val="99"/>
     <w:semiHidden/>
     <w:unhideWhenUsed/>
@@ -4932,10 +5183,10 @@
       <w:shd w:val="clear" w:color="auto" w:fill="E1DFDD"/>
     </w:rPr>
   </w:style>
-  <w:style w:type="paragraph" w:styleId="Encabezado">
+  <w:style w:type="paragraph" w:styleId="Header">
     <w:name w:val="header"/>
     <w:basedOn w:val="Normal"/>
-    <w:link w:val="EncabezadoCar"/>
+    <w:link w:val="HeaderChar"/>
     <w:uiPriority w:val="99"/>
     <w:unhideWhenUsed/>
     <w:rsid w:val="004A0631"/>
@@ -4947,17 +5198,17 @@
       <w:spacing w:after="0" w:line="240" w:lineRule="auto"/>
     </w:pPr>
   </w:style>
-  <w:style w:type="character" w:customStyle="1" w:styleId="EncabezadoCar">
-    <w:name w:val="Encabezado Car"/>
-    <w:basedOn w:val="Fuentedeprrafopredeter"/>
-    <w:link w:val="Encabezado"/>
+  <w:style w:type="character" w:customStyle="1" w:styleId="HeaderChar">
+    <w:name w:val="Header Char"/>
+    <w:basedOn w:val="DefaultParagraphFont"/>
+    <w:link w:val="Header"/>
     <w:uiPriority w:val="99"/>
     <w:rsid w:val="004A0631"/>
   </w:style>
-  <w:style w:type="paragraph" w:styleId="Piedepgina">
+  <w:style w:type="paragraph" w:styleId="Footer">
     <w:name w:val="footer"/>
     <w:basedOn w:val="Normal"/>
-    <w:link w:val="PiedepginaCar"/>
+    <w:link w:val="FooterChar"/>
     <w:uiPriority w:val="99"/>
     <w:unhideWhenUsed/>
     <w:rsid w:val="004A0631"/>
@@ -4969,17 +5220,17 @@
       <w:spacing w:after="0" w:line="240" w:lineRule="auto"/>
     </w:pPr>
   </w:style>
-  <w:style w:type="character" w:customStyle="1" w:styleId="PiedepginaCar">
-    <w:name w:val="Pie de página Car"/>
-    <w:basedOn w:val="Fuentedeprrafopredeter"/>
-    <w:link w:val="Piedepgina"/>
+  <w:style w:type="character" w:customStyle="1" w:styleId="FooterChar">
+    <w:name w:val="Footer Char"/>
+    <w:basedOn w:val="DefaultParagraphFont"/>
+    <w:link w:val="Footer"/>
     <w:uiPriority w:val="99"/>
     <w:rsid w:val="004A0631"/>
   </w:style>
-  <w:style w:type="paragraph" w:styleId="HTMLconformatoprevio">
+  <w:style w:type="paragraph" w:styleId="HTMLPreformatted">
     <w:name w:val="HTML Preformatted"/>
     <w:basedOn w:val="Normal"/>
-    <w:link w:val="HTMLconformatoprevioCar"/>
+    <w:link w:val="HTMLPreformattedChar"/>
     <w:uiPriority w:val="99"/>
     <w:semiHidden/>
     <w:unhideWhenUsed/>
@@ -5014,10 +5265,10 @@
       <w14:ligatures w14:val="none"/>
     </w:rPr>
   </w:style>
-  <w:style w:type="character" w:customStyle="1" w:styleId="HTMLconformatoprevioCar">
-    <w:name w:val="HTML con formato previo Car"/>
-    <w:basedOn w:val="Fuentedeprrafopredeter"/>
-    <w:link w:val="HTMLconformatoprevio"/>
+  <w:style w:type="character" w:customStyle="1" w:styleId="HTMLPreformattedChar">
+    <w:name w:val="HTML Preformatted Char"/>
+    <w:basedOn w:val="DefaultParagraphFont"/>
+    <w:link w:val="HTMLPreformatted"/>
     <w:uiPriority w:val="99"/>
     <w:semiHidden/>
     <w:rsid w:val="005F3191"/>
@@ -5032,8 +5283,51 @@
   </w:style>
   <w:style w:type="character" w:customStyle="1" w:styleId="token">
     <w:name w:val="token"/>
-    <w:basedOn w:val="Fuentedeprrafopredeter"/>
+    <w:basedOn w:val="DefaultParagraphFont"/>
     <w:rsid w:val="005F3191"/>
+  </w:style>
+  <w:style w:type="paragraph" w:customStyle="1" w:styleId="BlockCode">
+    <w:name w:val="Block Code"/>
+    <w:basedOn w:val="PlainText"/>
+    <w:next w:val="Normal"/>
+    <w:qFormat/>
+    <w:rsid w:val="00973F4A"/>
+    <w:rPr>
+      <w:rFonts w:eastAsia="Arial"/>
+      <w:kern w:val="0"/>
+      <w:lang w:val="es" w:eastAsia="es-CL"/>
+      <w14:ligatures w14:val="none"/>
+    </w:rPr>
+  </w:style>
+  <w:style w:type="paragraph" w:styleId="PlainText">
+    <w:name w:val="Plain Text"/>
+    <w:basedOn w:val="Normal"/>
+    <w:link w:val="PlainTextChar"/>
+    <w:uiPriority w:val="99"/>
+    <w:semiHidden/>
+    <w:unhideWhenUsed/>
+    <w:rsid w:val="00973F4A"/>
+    <w:pPr>
+      <w:spacing w:after="0" w:line="240" w:lineRule="auto"/>
+    </w:pPr>
+    <w:rPr>
+      <w:rFonts w:ascii="Consolas" w:hAnsi="Consolas" w:cs="Consolas"/>
+      <w:sz w:val="21"/>
+      <w:szCs w:val="21"/>
+    </w:rPr>
+  </w:style>
+  <w:style w:type="character" w:customStyle="1" w:styleId="PlainTextChar">
+    <w:name w:val="Plain Text Char"/>
+    <w:basedOn w:val="DefaultParagraphFont"/>
+    <w:link w:val="PlainText"/>
+    <w:uiPriority w:val="99"/>
+    <w:semiHidden/>
+    <w:rsid w:val="00973F4A"/>
+    <w:rPr>
+      <w:rFonts w:ascii="Consolas" w:hAnsi="Consolas" w:cs="Consolas"/>
+      <w:sz w:val="21"/>
+      <w:szCs w:val="21"/>
+    </w:rPr>
   </w:style>
 </w:styles>
 </file>

</xml_diff>